<commit_message>
casi termino la ponencia para congreso
</commit_message>
<xml_diff>
--- a/propuesta/prop_invest/congreso_internacional_entornos_aprendizaje_innovadores/1_ponencia.docx
+++ b/propuesta/prop_invest/congreso_internacional_entornos_aprendizaje_innovadores/1_ponencia.docx
@@ -1,6 +1,6 @@
 
 <file path=word/document.xml><?xml version="1.0" encoding="utf-8"?>
-<w:document xmlns:wpc="http://schemas.microsoft.com/office/word/2010/wordprocessingCanvas" xmlns:cx="http://schemas.microsoft.com/office/drawing/2014/chartex" xmlns:cx1="http://schemas.microsoft.com/office/drawing/2015/9/8/chartex" xmlns:cx2="http://schemas.microsoft.com/office/drawing/2015/10/21/chartex" xmlns:cx3="http://schemas.microsoft.com/office/drawing/2016/5/9/chartex" xmlns:cx4="http://schemas.microsoft.com/office/drawing/2016/5/10/chartex" xmlns:cx5="http://schemas.microsoft.com/office/drawing/2016/5/11/chartex" xmlns:cx6="http://schemas.microsoft.com/office/drawing/2016/5/12/chartex" xmlns:cx7="http://schemas.microsoft.com/office/drawing/2016/5/13/chartex" xmlns:cx8="http://schemas.microsoft.com/office/drawing/2016/5/14/chartex" xmlns:mc="http://schemas.openxmlformats.org/markup-compatibility/2006" xmlns:aink="http://schemas.microsoft.com/office/drawing/2016/ink" xmlns:am3d="http://schemas.microsoft.com/office/drawing/2017/model3d" xmlns:o="urn:schemas-microsoft-com:office:office" xmlns:r="http://schemas.openxmlformats.org/officeDocument/2006/relationships" xmlns:m="http://schemas.openxmlformats.org/officeDocument/2006/math" xmlns:v="urn:schemas-microsoft-com:vml" xmlns:wp14="http://schemas.microsoft.com/office/word/2010/wordprocessingDrawing" xmlns:wp="http://schemas.openxmlformats.org/drawingml/2006/wordprocessingDrawing" xmlns:w10="urn:schemas-microsoft-com:office:word" xmlns:w="http://schemas.openxmlformats.org/wordprocessingml/2006/main" xmlns:w14="http://schemas.microsoft.com/office/word/2010/wordml" xmlns:w15="http://schemas.microsoft.com/office/word/2012/wordml" xmlns:w16cex="http://schemas.microsoft.com/office/word/2018/wordml/cex" xmlns:w16cid="http://schemas.microsoft.com/office/word/2016/wordml/cid" xmlns:w16="http://schemas.microsoft.com/office/word/2018/wordml" xmlns:w16sdtdh="http://schemas.microsoft.com/office/word/2020/wordml/sdtdatahash" xmlns:w16se="http://schemas.microsoft.com/office/word/2015/wordml/symex" xmlns:wpg="http://schemas.microsoft.com/office/word/2010/wordprocessingGroup" xmlns:wpi="http://schemas.microsoft.com/office/word/2010/wordprocessingInk" xmlns:wne="http://schemas.microsoft.com/office/word/2006/wordml" xmlns:wps="http://schemas.microsoft.com/office/word/2010/wordprocessingShape" mc:Ignorable="w14 w15 w16se w16cid w16 w16cex w16sdtdh wp14">
+<w:document xmlns:wpc="http://schemas.microsoft.com/office/word/2010/wordprocessingCanvas" xmlns:cx="http://schemas.microsoft.com/office/drawing/2014/chartex" xmlns:cx1="http://schemas.microsoft.com/office/drawing/2015/9/8/chartex" xmlns:cx2="http://schemas.microsoft.com/office/drawing/2015/10/21/chartex" xmlns:cx3="http://schemas.microsoft.com/office/drawing/2016/5/9/chartex" xmlns:cx4="http://schemas.microsoft.com/office/drawing/2016/5/10/chartex" xmlns:cx5="http://schemas.microsoft.com/office/drawing/2016/5/11/chartex" xmlns:cx6="http://schemas.microsoft.com/office/drawing/2016/5/12/chartex" xmlns:cx7="http://schemas.microsoft.com/office/drawing/2016/5/13/chartex" xmlns:cx8="http://schemas.microsoft.com/office/drawing/2016/5/14/chartex" xmlns:mc="http://schemas.openxmlformats.org/markup-compatibility/2006" xmlns:aink="http://schemas.microsoft.com/office/drawing/2016/ink" xmlns:am3d="http://schemas.microsoft.com/office/drawing/2017/model3d" xmlns:o="urn:schemas-microsoft-com:office:office" xmlns:oel="http://schemas.microsoft.com/office/2019/extlst" xmlns:r="http://schemas.openxmlformats.org/officeDocument/2006/relationships" xmlns:m="http://schemas.openxmlformats.org/officeDocument/2006/math" xmlns:v="urn:schemas-microsoft-com:vml" xmlns:wp14="http://schemas.microsoft.com/office/word/2010/wordprocessingDrawing" xmlns:wp="http://schemas.openxmlformats.org/drawingml/2006/wordprocessingDrawing" xmlns:w10="urn:schemas-microsoft-com:office:word" xmlns:w="http://schemas.openxmlformats.org/wordprocessingml/2006/main" xmlns:w14="http://schemas.microsoft.com/office/word/2010/wordml" xmlns:w15="http://schemas.microsoft.com/office/word/2012/wordml" xmlns:w16cex="http://schemas.microsoft.com/office/word/2018/wordml/cex" xmlns:w16cid="http://schemas.microsoft.com/office/word/2016/wordml/cid" xmlns:w16="http://schemas.microsoft.com/office/word/2018/wordml" xmlns:w16du="http://schemas.microsoft.com/office/word/2023/wordml/word16du" xmlns:w16sdtdh="http://schemas.microsoft.com/office/word/2020/wordml/sdtdatahash" xmlns:w16se="http://schemas.microsoft.com/office/word/2015/wordml/symex" xmlns:wpg="http://schemas.microsoft.com/office/word/2010/wordprocessingGroup" xmlns:wpi="http://schemas.microsoft.com/office/word/2010/wordprocessingInk" xmlns:wne="http://schemas.microsoft.com/office/word/2006/wordml" xmlns:wps="http://schemas.microsoft.com/office/word/2010/wordprocessingShape" mc:Ignorable="w14 w15 w16se w16cid w16 w16cex w16sdtdh wp14">
   <w:body>
     <w:p>
       <w:pPr>
@@ -91,7 +91,7 @@
     </w:p>
     <w:p>
       <w:pPr>
-        <w:pStyle w:val="Ttulo"/>
+        <w:pStyle w:val="Title"/>
         <w:ind w:firstLine="0"/>
         <w:jc w:val="center"/>
         <w:rPr>
@@ -139,7 +139,7 @@
     </w:p>
     <w:p>
       <w:pPr>
-        <w:pStyle w:val="Ttulo"/>
+        <w:pStyle w:val="Title"/>
         <w:ind w:firstLine="0"/>
         <w:jc w:val="center"/>
         <w:rPr>
@@ -154,7 +154,7 @@
     </w:p>
     <w:p>
       <w:pPr>
-        <w:pStyle w:val="Ttulo"/>
+        <w:pStyle w:val="Title"/>
         <w:ind w:firstLine="0"/>
         <w:jc w:val="center"/>
         <w:rPr>
@@ -180,28 +180,6 @@
       <w:r>
         <w:rPr>
           <w:rFonts w:cs="Times New Roman"/>
-          <w:i w:val="0"/>
-          <w:iCs/>
-          <w:color w:val="auto"/>
-          <w:sz w:val="40"/>
-          <w:szCs w:val="42"/>
-        </w:rPr>
-        <w:t>Estructura de la Ponencia</w:t>
-      </w:r>
-      <w:r>
-        <w:rPr>
-          <w:rFonts w:cs="Times New Roman"/>
-          <w:i w:val="0"/>
-          <w:iCs/>
-          <w:color w:val="auto"/>
-          <w:sz w:val="40"/>
-          <w:szCs w:val="42"/>
-        </w:rPr>
-        <w:t xml:space="preserve"> </w:t>
-      </w:r>
-      <w:r>
-        <w:rPr>
-          <w:rFonts w:cs="Times New Roman"/>
           <w:b w:val="0"/>
           <w:i w:val="0"/>
           <w:iCs/>
@@ -214,327 +192,7 @@
     </w:p>
     <w:p>
       <w:pPr>
-        <w:pStyle w:val="Prrafodelista"/>
-        <w:numPr>
-          <w:ilvl w:val="0"/>
-          <w:numId w:val="1"/>
-        </w:numPr>
-        <w:spacing w:line="276" w:lineRule="auto"/>
-        <w:contextualSpacing/>
-        <w:jc w:val="left"/>
-        <w:rPr>
-          <w:b/>
-          <w:bCs/>
-          <w:sz w:val="40"/>
-          <w:szCs w:val="40"/>
-        </w:rPr>
-      </w:pPr>
-      <w:r>
-        <w:rPr>
-          <w:b/>
-          <w:bCs/>
-          <w:sz w:val="40"/>
-          <w:szCs w:val="40"/>
-        </w:rPr>
-        <w:t>Título</w:t>
-      </w:r>
-    </w:p>
-    <w:p>
-      <w:pPr>
-        <w:pStyle w:val="Prrafodelista"/>
-        <w:numPr>
-          <w:ilvl w:val="0"/>
-          <w:numId w:val="1"/>
-        </w:numPr>
-        <w:spacing w:line="276" w:lineRule="auto"/>
-        <w:contextualSpacing/>
-        <w:jc w:val="left"/>
-        <w:rPr>
-          <w:b/>
-          <w:bCs/>
-          <w:sz w:val="40"/>
-          <w:szCs w:val="40"/>
-        </w:rPr>
-      </w:pPr>
-      <w:r>
-        <w:rPr>
-          <w:b/>
-          <w:bCs/>
-          <w:sz w:val="40"/>
-          <w:szCs w:val="40"/>
-        </w:rPr>
-        <w:t>Autores</w:t>
-      </w:r>
-    </w:p>
-    <w:p>
-      <w:pPr>
-        <w:pStyle w:val="Prrafodelista"/>
-        <w:numPr>
-          <w:ilvl w:val="0"/>
-          <w:numId w:val="1"/>
-        </w:numPr>
-        <w:spacing w:line="276" w:lineRule="auto"/>
-        <w:contextualSpacing/>
-        <w:jc w:val="left"/>
-        <w:rPr>
-          <w:b/>
-          <w:bCs/>
-          <w:sz w:val="40"/>
-          <w:szCs w:val="40"/>
-        </w:rPr>
-      </w:pPr>
-      <w:r>
-        <w:rPr>
-          <w:b/>
-          <w:bCs/>
-          <w:sz w:val="40"/>
-          <w:szCs w:val="40"/>
-        </w:rPr>
-        <w:t>Resumen</w:t>
-      </w:r>
-    </w:p>
-    <w:p>
-      <w:pPr>
-        <w:pStyle w:val="Prrafodelista"/>
-        <w:numPr>
-          <w:ilvl w:val="0"/>
-          <w:numId w:val="1"/>
-        </w:numPr>
-        <w:spacing w:line="276" w:lineRule="auto"/>
-        <w:contextualSpacing/>
-        <w:jc w:val="left"/>
-        <w:rPr>
-          <w:b/>
-          <w:bCs/>
-          <w:sz w:val="40"/>
-          <w:szCs w:val="40"/>
-        </w:rPr>
-      </w:pPr>
-      <w:proofErr w:type="spellStart"/>
-      <w:r>
-        <w:rPr>
-          <w:b/>
-          <w:bCs/>
-          <w:sz w:val="40"/>
-          <w:szCs w:val="40"/>
-        </w:rPr>
-        <w:t>Abstract</w:t>
-      </w:r>
-      <w:proofErr w:type="spellEnd"/>
-    </w:p>
-    <w:p>
-      <w:pPr>
-        <w:pStyle w:val="Prrafodelista"/>
-        <w:numPr>
-          <w:ilvl w:val="0"/>
-          <w:numId w:val="1"/>
-        </w:numPr>
-        <w:spacing w:line="276" w:lineRule="auto"/>
-        <w:contextualSpacing/>
-        <w:jc w:val="left"/>
-        <w:rPr>
-          <w:b/>
-          <w:bCs/>
-          <w:sz w:val="40"/>
-          <w:szCs w:val="40"/>
-        </w:rPr>
-      </w:pPr>
-      <w:r>
-        <w:rPr>
-          <w:b/>
-          <w:bCs/>
-          <w:sz w:val="40"/>
-          <w:szCs w:val="40"/>
-        </w:rPr>
-        <w:t>Introducción</w:t>
-      </w:r>
-    </w:p>
-    <w:p>
-      <w:pPr>
-        <w:pStyle w:val="Prrafodelista"/>
-        <w:numPr>
-          <w:ilvl w:val="0"/>
-          <w:numId w:val="1"/>
-        </w:numPr>
-        <w:spacing w:line="276" w:lineRule="auto"/>
-        <w:contextualSpacing/>
-        <w:jc w:val="left"/>
-        <w:rPr>
-          <w:b/>
-          <w:bCs/>
-          <w:sz w:val="40"/>
-          <w:szCs w:val="40"/>
-        </w:rPr>
-      </w:pPr>
-      <w:r>
-        <w:rPr>
-          <w:b/>
-          <w:bCs/>
-          <w:sz w:val="40"/>
-          <w:szCs w:val="40"/>
-        </w:rPr>
-        <w:t xml:space="preserve">Metodología </w:t>
-      </w:r>
-    </w:p>
-    <w:p>
-      <w:pPr>
-        <w:pStyle w:val="Prrafodelista"/>
-        <w:numPr>
-          <w:ilvl w:val="0"/>
-          <w:numId w:val="1"/>
-        </w:numPr>
-        <w:spacing w:line="276" w:lineRule="auto"/>
-        <w:contextualSpacing/>
-        <w:jc w:val="left"/>
-        <w:rPr>
-          <w:b/>
-          <w:bCs/>
-          <w:sz w:val="40"/>
-          <w:szCs w:val="40"/>
-        </w:rPr>
-      </w:pPr>
-      <w:r>
-        <w:rPr>
-          <w:b/>
-          <w:bCs/>
-          <w:sz w:val="40"/>
-          <w:szCs w:val="40"/>
-        </w:rPr>
-        <w:t xml:space="preserve">Resultados </w:t>
-      </w:r>
-    </w:p>
-    <w:p>
-      <w:pPr>
-        <w:pStyle w:val="Prrafodelista"/>
-        <w:numPr>
-          <w:ilvl w:val="0"/>
-          <w:numId w:val="1"/>
-        </w:numPr>
-        <w:spacing w:line="276" w:lineRule="auto"/>
-        <w:contextualSpacing/>
-        <w:jc w:val="left"/>
-        <w:rPr>
-          <w:b/>
-          <w:bCs/>
-          <w:sz w:val="40"/>
-          <w:szCs w:val="40"/>
-        </w:rPr>
-      </w:pPr>
-      <w:r>
-        <w:rPr>
-          <w:b/>
-          <w:bCs/>
-          <w:sz w:val="40"/>
-          <w:szCs w:val="40"/>
-        </w:rPr>
-        <w:t xml:space="preserve">Discusión (Conclusiones) </w:t>
-      </w:r>
-    </w:p>
-    <w:p>
-      <w:pPr>
-        <w:pStyle w:val="Prrafodelista"/>
-        <w:numPr>
-          <w:ilvl w:val="0"/>
-          <w:numId w:val="1"/>
-        </w:numPr>
-        <w:spacing w:line="276" w:lineRule="auto"/>
-        <w:contextualSpacing/>
-        <w:jc w:val="left"/>
-        <w:rPr>
-          <w:b/>
-          <w:bCs/>
-          <w:sz w:val="40"/>
-          <w:szCs w:val="40"/>
-        </w:rPr>
-      </w:pPr>
-      <w:r>
-        <w:rPr>
-          <w:b/>
-          <w:bCs/>
-          <w:sz w:val="40"/>
-          <w:szCs w:val="40"/>
-        </w:rPr>
-        <w:t>Referencias bibliográficas</w:t>
-      </w:r>
-    </w:p>
-    <w:p>
-      <w:pPr>
-        <w:pStyle w:val="Prrafodelista"/>
-        <w:rPr>
-          <w:b/>
-          <w:bCs/>
-          <w:sz w:val="20"/>
-          <w:szCs w:val="20"/>
-        </w:rPr>
-      </w:pPr>
-    </w:p>
-    <w:p>
-      <w:pPr>
-        <w:pStyle w:val="Prrafodelista"/>
-        <w:rPr>
-          <w:b/>
-          <w:bCs/>
-          <w:sz w:val="20"/>
-          <w:szCs w:val="20"/>
-        </w:rPr>
-      </w:pPr>
-    </w:p>
-    <w:p>
-      <w:pPr>
-        <w:pStyle w:val="Ttulo"/>
-        <w:ind w:firstLine="0"/>
-        <w:jc w:val="center"/>
-        <w:rPr>
-          <w:rFonts w:cs="Times New Roman"/>
-          <w:i w:val="0"/>
-          <w:iCs/>
-          <w:color w:val="auto"/>
-          <w:sz w:val="40"/>
-          <w:szCs w:val="42"/>
-        </w:rPr>
-      </w:pPr>
-      <w:r>
-        <w:rPr>
-          <w:rFonts w:cs="Times New Roman"/>
-          <w:i w:val="0"/>
-          <w:iCs/>
-          <w:color w:val="auto"/>
-          <w:sz w:val="40"/>
-          <w:szCs w:val="42"/>
-        </w:rPr>
-        <w:t>Ejemplo de la Ponencia</w:t>
-      </w:r>
-    </w:p>
-    <w:p>
-      <w:pPr>
-        <w:pStyle w:val="Prrafodelista"/>
-        <w:ind w:firstLine="0"/>
-        <w:rPr>
-          <w:b/>
-          <w:bCs/>
-        </w:rPr>
-      </w:pPr>
-    </w:p>
-    <w:p>
-      <w:pPr>
-        <w:pStyle w:val="Ttulo"/>
-        <w:ind w:firstLine="0"/>
-        <w:jc w:val="center"/>
-        <w:rPr>
-          <w:rFonts w:cs="Times New Roman"/>
-          <w:b w:val="0"/>
-          <w:bCs/>
-          <w:i w:val="0"/>
-          <w:iCs/>
-          <w:color w:val="auto"/>
-          <w:sz w:val="40"/>
-          <w:szCs w:val="42"/>
-        </w:rPr>
-      </w:pPr>
-    </w:p>
-    <w:p>
-      <w:pPr>
-        <w:pStyle w:val="Prrafodelista"/>
+        <w:pStyle w:val="ListParagraph"/>
         <w:spacing w:line="276" w:lineRule="auto"/>
         <w:ind w:firstLine="0"/>
         <w:contextualSpacing/>
@@ -546,239 +204,71 @@
           <w:szCs w:val="40"/>
         </w:rPr>
       </w:pPr>
-    </w:p>
-    <w:p>
-      <w:pPr>
-        <w:pStyle w:val="Prrafodelista"/>
+      <w:r>
+        <w:rPr>
+          <w:b/>
+          <w:bCs/>
+          <w:sz w:val="40"/>
+          <w:szCs w:val="40"/>
+        </w:rPr>
+        <w:t xml:space="preserve">Enseñar Machine </w:t>
+      </w:r>
+      <w:proofErr w:type="spellStart"/>
+      <w:r>
+        <w:rPr>
+          <w:b/>
+          <w:bCs/>
+          <w:sz w:val="40"/>
+          <w:szCs w:val="40"/>
+        </w:rPr>
+        <w:t>Learning</w:t>
+      </w:r>
+      <w:proofErr w:type="spellEnd"/>
+      <w:r>
+        <w:rPr>
+          <w:b/>
+          <w:bCs/>
+          <w:sz w:val="40"/>
+          <w:szCs w:val="40"/>
+        </w:rPr>
+        <w:t xml:space="preserve"> en la Universidad de Antioquia con Google </w:t>
+      </w:r>
+      <w:proofErr w:type="spellStart"/>
+      <w:r>
+        <w:rPr>
+          <w:b/>
+          <w:bCs/>
+          <w:sz w:val="40"/>
+          <w:szCs w:val="40"/>
+        </w:rPr>
+        <w:t>Colab</w:t>
+      </w:r>
+      <w:proofErr w:type="spellEnd"/>
+      <w:r>
+        <w:rPr>
+          <w:b/>
+          <w:bCs/>
+          <w:sz w:val="40"/>
+          <w:szCs w:val="40"/>
+        </w:rPr>
+        <w:t>, GitHub y YouTube</w:t>
+      </w:r>
+    </w:p>
+    <w:p>
+      <w:pPr>
+        <w:pStyle w:val="ListParagraph"/>
         <w:spacing w:line="276" w:lineRule="auto"/>
         <w:ind w:firstLine="0"/>
         <w:contextualSpacing/>
         <w:jc w:val="center"/>
+      </w:pPr>
+      <w:r>
         <w:rPr>
           <w:b/>
           <w:bCs/>
           <w:sz w:val="40"/>
           <w:szCs w:val="40"/>
         </w:rPr>
-      </w:pPr>
-    </w:p>
-    <w:p>
-      <w:pPr>
-        <w:pStyle w:val="Prrafodelista"/>
-        <w:spacing w:line="276" w:lineRule="auto"/>
-        <w:ind w:firstLine="0"/>
-        <w:contextualSpacing/>
-        <w:jc w:val="center"/>
-        <w:rPr>
-          <w:b/>
-          <w:bCs/>
-          <w:sz w:val="40"/>
-          <w:szCs w:val="40"/>
-        </w:rPr>
-      </w:pPr>
-    </w:p>
-    <w:p>
-      <w:pPr>
-        <w:pStyle w:val="Prrafodelista"/>
-        <w:spacing w:line="276" w:lineRule="auto"/>
-        <w:ind w:firstLine="0"/>
-        <w:contextualSpacing/>
-        <w:jc w:val="center"/>
-        <w:rPr>
-          <w:b/>
-          <w:bCs/>
-          <w:sz w:val="40"/>
-          <w:szCs w:val="40"/>
-        </w:rPr>
-      </w:pPr>
-    </w:p>
-    <w:p>
-      <w:pPr>
-        <w:pStyle w:val="Prrafodelista"/>
-        <w:spacing w:line="276" w:lineRule="auto"/>
-        <w:ind w:firstLine="0"/>
-        <w:contextualSpacing/>
-        <w:jc w:val="center"/>
-        <w:rPr>
-          <w:b/>
-          <w:bCs/>
-          <w:sz w:val="40"/>
-          <w:szCs w:val="40"/>
-        </w:rPr>
-      </w:pPr>
-      <w:r>
-        <w:rPr>
-          <w:b/>
-          <w:bCs/>
-          <w:sz w:val="40"/>
-          <w:szCs w:val="40"/>
-        </w:rPr>
-        <w:lastRenderedPageBreak/>
-        <w:t>Título</w:t>
-      </w:r>
-    </w:p>
-    <w:p>
-      <w:pPr>
-        <w:pStyle w:val="Ttulo"/>
-        <w:ind w:firstLine="0"/>
-        <w:jc w:val="center"/>
-        <w:rPr>
-          <w:rFonts w:cs="Times New Roman"/>
-          <w:b w:val="0"/>
-          <w:bCs/>
-          <w:i w:val="0"/>
-          <w:iCs/>
-          <w:color w:val="auto"/>
-          <w:sz w:val="20"/>
-          <w:szCs w:val="20"/>
-        </w:rPr>
-      </w:pPr>
-      <w:r>
-        <w:rPr>
-          <w:rFonts w:cs="Times New Roman"/>
-          <w:color w:val="auto"/>
-          <w:sz w:val="20"/>
-          <w:szCs w:val="20"/>
-        </w:rPr>
-        <w:t>Describe con exactitud el contenido del texto. Es l</w:t>
-      </w:r>
-      <w:r>
-        <w:rPr>
-          <w:rFonts w:cs="Times New Roman"/>
-          <w:b w:val="0"/>
-          <w:bCs/>
-          <w:i w:val="0"/>
-          <w:iCs/>
-          <w:color w:val="auto"/>
-          <w:sz w:val="20"/>
-          <w:szCs w:val="20"/>
-        </w:rPr>
-        <w:t xml:space="preserve">lamativo, no mayor a 16 palabras. </w:t>
-      </w:r>
-    </w:p>
-    <w:p>
-      <w:pPr>
-        <w:pStyle w:val="Ttulo"/>
-        <w:ind w:firstLine="0"/>
-        <w:jc w:val="left"/>
-        <w:rPr>
-          <w:rFonts w:cs="Times New Roman"/>
-          <w:b w:val="0"/>
-          <w:bCs/>
-          <w:i w:val="0"/>
-          <w:iCs/>
-          <w:color w:val="auto"/>
-          <w:sz w:val="20"/>
-          <w:szCs w:val="20"/>
-        </w:rPr>
-      </w:pPr>
-      <w:r>
-        <w:rPr>
-          <w:rFonts w:cs="Times New Roman"/>
-          <w:b w:val="0"/>
-          <w:bCs/>
-          <w:i w:val="0"/>
-          <w:iCs/>
-          <w:color w:val="auto"/>
-          <w:sz w:val="20"/>
-          <w:szCs w:val="20"/>
-        </w:rPr>
-        <w:t>Por ejemplo:</w:t>
-      </w:r>
-    </w:p>
-    <w:p>
-      <w:pPr>
-        <w:shd w:val="clear" w:color="auto" w:fill="FFFFFF"/>
-        <w:spacing w:after="0" w:line="360" w:lineRule="auto"/>
-        <w:jc w:val="center"/>
-        <w:rPr>
-          <w:rFonts w:eastAsia="Arial"/>
-          <w:b/>
-          <w:bCs/>
-          <w:i/>
-          <w:iCs/>
-          <w:sz w:val="40"/>
-          <w:szCs w:val="40"/>
-        </w:rPr>
-      </w:pPr>
-      <w:r>
-        <w:rPr>
-          <w:rFonts w:eastAsia="Arial"/>
-          <w:b/>
-          <w:bCs/>
-          <w:i/>
-          <w:iCs/>
-          <w:sz w:val="40"/>
-          <w:szCs w:val="40"/>
-        </w:rPr>
-        <w:t>Fortalecer balanceo de ecuaciones químicas por medio de una App.</w:t>
-      </w:r>
-    </w:p>
-    <w:p>
-      <w:pPr>
-        <w:pBdr>
-          <w:top w:val="nil"/>
-          <w:left w:val="nil"/>
-          <w:bottom w:val="nil"/>
-          <w:right w:val="nil"/>
-          <w:between w:val="nil"/>
-        </w:pBdr>
-        <w:spacing w:after="0"/>
-        <w:jc w:val="center"/>
-        <w:rPr>
-          <w:rFonts w:eastAsia="Arial"/>
-          <w:bCs/>
-          <w:sz w:val="36"/>
-          <w:szCs w:val="36"/>
-          <w:lang w:val="en-US"/>
-        </w:rPr>
-      </w:pPr>
-      <w:r>
-        <w:rPr>
-          <w:rFonts w:eastAsia="Arial"/>
-          <w:bCs/>
-          <w:sz w:val="36"/>
-          <w:szCs w:val="36"/>
-          <w:lang w:val="en-US"/>
-        </w:rPr>
-        <w:t>Strengthen balancing of chemical equations through an App.</w:t>
-      </w:r>
-    </w:p>
-    <w:p>
-      <w:pPr>
-        <w:pBdr>
-          <w:top w:val="nil"/>
-          <w:left w:val="nil"/>
-          <w:bottom w:val="nil"/>
-          <w:right w:val="nil"/>
-          <w:between w:val="nil"/>
-        </w:pBdr>
-        <w:spacing w:after="0"/>
-        <w:jc w:val="center"/>
-        <w:rPr>
-          <w:rFonts w:eastAsia="Arial"/>
-          <w:bCs/>
-          <w:sz w:val="36"/>
-          <w:szCs w:val="36"/>
-          <w:lang w:val="en-US"/>
-        </w:rPr>
-      </w:pPr>
-    </w:p>
-    <w:p>
-      <w:pPr>
-        <w:pStyle w:val="Prrafodelista"/>
-        <w:spacing w:line="276" w:lineRule="auto"/>
-        <w:ind w:firstLine="0"/>
-        <w:contextualSpacing/>
-        <w:jc w:val="center"/>
-      </w:pPr>
-      <w:r>
-        <w:rPr>
-          <w:b/>
-          <w:bCs/>
-          <w:sz w:val="40"/>
-          <w:szCs w:val="40"/>
-        </w:rPr>
         <w:t>Autores</w:t>
       </w:r>
     </w:p>
@@ -796,7 +286,14 @@
           <w:rFonts w:eastAsia="Arial"/>
           <w:i/>
         </w:rPr>
-        <w:t xml:space="preserve">Gil Piedrahita Sergio l </w:t>
+        <w:t>Cañas Campillo, Marco Julio</w:t>
+      </w:r>
+      <w:r>
+        <w:rPr>
+          <w:rFonts w:eastAsia="Arial"/>
+          <w:i/>
+        </w:rPr>
+        <w:t xml:space="preserve"> </w:t>
       </w:r>
       <w:r>
         <w:rPr>
@@ -836,7 +333,7 @@
           <w:rFonts w:eastAsia="Arial"/>
           <w:i/>
         </w:rPr>
-        <w:t>naranjo@hotmail.com</w:t>
+        <w:t>marco.canas@udea.edu.co</w:t>
       </w:r>
     </w:p>
     <w:p>
@@ -848,12 +345,37 @@
           <w:i/>
         </w:rPr>
       </w:pPr>
+      <w:proofErr w:type="spellStart"/>
       <w:r>
         <w:rPr>
           <w:rFonts w:eastAsia="Arial"/>
           <w:i/>
         </w:rPr>
-        <w:t xml:space="preserve">Soto Bernal Lina </w:t>
+        <w:t>Lopez</w:t>
+      </w:r>
+      <w:proofErr w:type="spellEnd"/>
+      <w:r>
+        <w:rPr>
+          <w:rFonts w:eastAsia="Arial"/>
+          <w:i/>
+        </w:rPr>
+        <w:t xml:space="preserve"> </w:t>
+      </w:r>
+      <w:proofErr w:type="spellStart"/>
+      <w:r>
+        <w:rPr>
+          <w:rFonts w:eastAsia="Arial"/>
+          <w:i/>
+        </w:rPr>
+        <w:t>Nohava</w:t>
+      </w:r>
+      <w:proofErr w:type="spellEnd"/>
+      <w:r>
+        <w:rPr>
+          <w:rFonts w:eastAsia="Arial"/>
+          <w:i/>
+        </w:rPr>
+        <w:t xml:space="preserve">, Luz Mariela </w:t>
       </w:r>
       <w:r>
         <w:rPr>
@@ -898,7 +420,7 @@
         <w:jc w:val="right"/>
       </w:pPr>
       <w:r>
-        <w:t>Estudiantes de Ingeniería Informática</w:t>
+        <w:t>Profesor de matemática y Bibliotecóloga</w:t>
       </w:r>
     </w:p>
     <w:p>
@@ -909,11 +431,9 @@
       <w:r>
         <w:t xml:space="preserve">Universidad </w:t>
       </w:r>
-      <w:proofErr w:type="spellStart"/>
-      <w:r>
-        <w:t>Marlindo</w:t>
-      </w:r>
-      <w:proofErr w:type="spellEnd"/>
+      <w:r>
+        <w:t>de Antioquia</w:t>
+      </w:r>
     </w:p>
     <w:p>
       <w:pPr>
@@ -921,7 +441,10 @@
         <w:jc w:val="right"/>
       </w:pPr>
       <w:r>
-        <w:t>Cali-Colombia</w:t>
+        <w:t>Caucasia</w:t>
+      </w:r>
+      <w:r>
+        <w:t>-Colombia</w:t>
       </w:r>
     </w:p>
     <w:p>
@@ -1029,40 +552,66 @@
           <w:b/>
           <w:bCs/>
         </w:rPr>
-        <w:t xml:space="preserve"> de</w:t>
-      </w:r>
-      <w:r>
-        <w:rPr>
-          <w:rFonts w:eastAsia="Arial"/>
-          <w:b/>
-          <w:bCs/>
-        </w:rPr>
-        <w:t>l Valle del Cauca</w:t>
-      </w:r>
-      <w:r>
-        <w:rPr>
-          <w:rFonts w:eastAsia="Arial"/>
-          <w:b/>
-          <w:bCs/>
-        </w:rPr>
-        <w:t>, en el municipio de San</w:t>
-      </w:r>
-      <w:r>
-        <w:rPr>
-          <w:rFonts w:eastAsia="Arial"/>
-          <w:b/>
-          <w:bCs/>
-        </w:rPr>
-        <w:t xml:space="preserve"> Gil </w:t>
-      </w:r>
-      <w:r>
-        <w:rPr>
-          <w:rFonts w:eastAsia="Arial"/>
-          <w:b/>
-          <w:sz w:val="20"/>
-          <w:szCs w:val="20"/>
-        </w:rPr>
-        <w:t>Arial, 10 puntos, Negrita, alineado a la izquierda)</w:t>
+        <w:t xml:space="preserve"> </w:t>
+      </w:r>
+      <w:proofErr w:type="spellStart"/>
+      <w:r>
+        <w:rPr>
+          <w:rFonts w:eastAsia="Arial"/>
+          <w:b/>
+          <w:bCs/>
+        </w:rPr>
+        <w:t>de</w:t>
+      </w:r>
+      <w:r>
+        <w:rPr>
+          <w:rFonts w:eastAsia="Arial"/>
+          <w:b/>
+          <w:bCs/>
+        </w:rPr>
+        <w:t>l</w:t>
+      </w:r>
+      <w:proofErr w:type="spellEnd"/>
+      <w:r>
+        <w:rPr>
+          <w:rFonts w:eastAsia="Arial"/>
+          <w:b/>
+          <w:bCs/>
+        </w:rPr>
+        <w:t xml:space="preserve"> </w:t>
+      </w:r>
+      <w:r>
+        <w:rPr>
+          <w:rFonts w:eastAsia="Arial"/>
+          <w:b/>
+          <w:bCs/>
+        </w:rPr>
+        <w:t>Antioquia</w:t>
+      </w:r>
+      <w:r>
+        <w:rPr>
+          <w:rFonts w:eastAsia="Arial"/>
+          <w:b/>
+          <w:bCs/>
+        </w:rPr>
+        <w:t>, en el municipio de</w:t>
+      </w:r>
+      <w:r>
+        <w:rPr>
+          <w:rFonts w:eastAsia="Arial"/>
+          <w:b/>
+          <w:bCs/>
+        </w:rPr>
+        <w:t xml:space="preserve"> Caucasia y el municipio de Medellín</w:t>
+      </w:r>
+      <w:r>
+        <w:rPr>
+          <w:rFonts w:eastAsia="Arial"/>
+          <w:b/>
+          <w:sz w:val="20"/>
+          <w:szCs w:val="20"/>
+        </w:rPr>
+        <w:t>, 10 puntos, Negrita, alineado a la izquierda)</w:t>
       </w:r>
     </w:p>
     <w:p>
@@ -1130,24 +679,24 @@
           <w:sz w:val="40"/>
           <w:szCs w:val="40"/>
         </w:rPr>
+        <w:t>Resumen</w:t>
+      </w:r>
+    </w:p>
+    <w:p>
+      <w:pPr>
+        <w:rPr>
+          <w:rFonts w:eastAsia="Arial"/>
+          <w:sz w:val="20"/>
+          <w:szCs w:val="20"/>
+        </w:rPr>
+      </w:pPr>
+      <w:r>
+        <w:rPr>
+          <w:rFonts w:eastAsia="Arial"/>
+          <w:sz w:val="20"/>
+          <w:szCs w:val="20"/>
+        </w:rPr>
         <w:lastRenderedPageBreak/>
-        <w:t>Resumen</w:t>
-      </w:r>
-    </w:p>
-    <w:p>
-      <w:pPr>
-        <w:rPr>
-          <w:rFonts w:eastAsia="Arial"/>
-          <w:sz w:val="20"/>
-          <w:szCs w:val="20"/>
-        </w:rPr>
-      </w:pPr>
-      <w:r>
-        <w:rPr>
-          <w:rFonts w:eastAsia="Arial"/>
-          <w:sz w:val="20"/>
-          <w:szCs w:val="20"/>
-        </w:rPr>
         <w:t>En el resumen se sintetiza los principales aspectos del trabajo que se va a presentar en el evento, sin citas bibliográficas. Al terminar de diligenciar este formato elimine los comentarios en azul. El resumen debe estar fundamentado en los siguientes subtítulos. No incluir los subtítulos.</w:t>
       </w:r>
       <w:r>
@@ -1178,309 +727,619 @@
     <w:p>
       <w:pPr>
         <w:spacing w:after="0"/>
-        <w:rPr>
-          <w:b/>
-          <w:sz w:val="36"/>
-          <w:szCs w:val="36"/>
-        </w:rPr>
-      </w:pPr>
-      <w:r>
-        <w:rPr>
-          <w:b/>
-          <w:sz w:val="36"/>
-          <w:szCs w:val="36"/>
-        </w:rPr>
-        <w:t>Por ejemplo:</w:t>
+        <w:ind w:firstLine="0"/>
+        <w:jc w:val="center"/>
+        <w:rPr>
+          <w:rFonts w:ascii="Arial" w:hAnsi="Arial" w:cs="Arial"/>
+          <w:b/>
+          <w:sz w:val="20"/>
+          <w:szCs w:val="20"/>
+        </w:rPr>
+      </w:pPr>
+      <w:r>
+        <w:rPr>
+          <w:rFonts w:ascii="Arial" w:hAnsi="Arial" w:cs="Arial"/>
+          <w:b/>
+          <w:sz w:val="20"/>
+          <w:szCs w:val="20"/>
+        </w:rPr>
+        <w:t xml:space="preserve">"Esta propuesta de enseñanza del machine </w:t>
+      </w:r>
+      <w:proofErr w:type="spellStart"/>
+      <w:r>
+        <w:rPr>
+          <w:rFonts w:ascii="Arial" w:hAnsi="Arial" w:cs="Arial"/>
+          <w:b/>
+          <w:sz w:val="20"/>
+          <w:szCs w:val="20"/>
+        </w:rPr>
+        <w:t>learning</w:t>
+      </w:r>
+      <w:proofErr w:type="spellEnd"/>
+      <w:r>
+        <w:rPr>
+          <w:rFonts w:ascii="Arial" w:hAnsi="Arial" w:cs="Arial"/>
+          <w:b/>
+          <w:sz w:val="20"/>
+          <w:szCs w:val="20"/>
+        </w:rPr>
+        <w:t xml:space="preserve"> con enfoque pedagógico de aprendizaje invertido se centra en la utilización del lenguaje de programación Python. Nuestro objetivo es proporcionar a los estudiantes una experiencia práctica y significativa en el campo del machine </w:t>
+      </w:r>
+      <w:proofErr w:type="spellStart"/>
+      <w:r>
+        <w:rPr>
+          <w:rFonts w:ascii="Arial" w:hAnsi="Arial" w:cs="Arial"/>
+          <w:b/>
+          <w:sz w:val="20"/>
+          <w:szCs w:val="20"/>
+        </w:rPr>
+        <w:t>learning</w:t>
+      </w:r>
+      <w:proofErr w:type="spellEnd"/>
+      <w:r>
+        <w:rPr>
+          <w:rFonts w:ascii="Arial" w:hAnsi="Arial" w:cs="Arial"/>
+          <w:b/>
+          <w:sz w:val="20"/>
+          <w:szCs w:val="20"/>
+        </w:rPr>
+        <w:t>, combinando la teoría con la aplicación directa.</w:t>
+      </w:r>
+      <w:r>
+        <w:rPr>
+          <w:rFonts w:ascii="Arial" w:hAnsi="Arial" w:cs="Arial"/>
+          <w:b/>
+          <w:sz w:val="20"/>
+          <w:szCs w:val="20"/>
+        </w:rPr>
+        <w:t xml:space="preserve"> </w:t>
+      </w:r>
+      <w:r>
+        <w:rPr>
+          <w:rFonts w:ascii="Arial" w:hAnsi="Arial" w:cs="Arial"/>
+          <w:b/>
+          <w:sz w:val="20"/>
+          <w:szCs w:val="20"/>
+        </w:rPr>
+        <w:t xml:space="preserve">A través de proyectos y actividades interactivas, los estudiantes aprenderán los conceptos fundamentales del machine </w:t>
+      </w:r>
+      <w:proofErr w:type="spellStart"/>
+      <w:r>
+        <w:rPr>
+          <w:rFonts w:ascii="Arial" w:hAnsi="Arial" w:cs="Arial"/>
+          <w:b/>
+          <w:sz w:val="20"/>
+          <w:szCs w:val="20"/>
+        </w:rPr>
+        <w:t>learning</w:t>
+      </w:r>
+      <w:proofErr w:type="spellEnd"/>
+      <w:r>
+        <w:rPr>
+          <w:rFonts w:ascii="Arial" w:hAnsi="Arial" w:cs="Arial"/>
+          <w:b/>
+          <w:sz w:val="20"/>
+          <w:szCs w:val="20"/>
+        </w:rPr>
+        <w:t xml:space="preserve"> y desarrollarán habilidades de programación en Python para implementar algoritmos de aprendizaje automático. Creemos que esta combinación de aprendizaje invertido y Python permitirá a los estudiantes adquirir una comprensión profunda y práctica del machine </w:t>
+      </w:r>
+      <w:proofErr w:type="spellStart"/>
+      <w:r>
+        <w:rPr>
+          <w:rFonts w:ascii="Arial" w:hAnsi="Arial" w:cs="Arial"/>
+          <w:b/>
+          <w:sz w:val="20"/>
+          <w:szCs w:val="20"/>
+        </w:rPr>
+        <w:t>learning</w:t>
+      </w:r>
+      <w:proofErr w:type="spellEnd"/>
+      <w:r>
+        <w:rPr>
+          <w:rFonts w:ascii="Arial" w:hAnsi="Arial" w:cs="Arial"/>
+          <w:b/>
+          <w:sz w:val="20"/>
+          <w:szCs w:val="20"/>
+        </w:rPr>
+        <w:t>, preparándolos para enfrentar desafíos reales en el mundo de la inteligencia artificial."</w:t>
+      </w:r>
+      <w:r>
+        <w:t xml:space="preserve"> </w:t>
+      </w:r>
+      <w:r>
+        <w:rPr>
+          <w:rFonts w:ascii="Arial" w:hAnsi="Arial" w:cs="Arial"/>
+          <w:b/>
+          <w:sz w:val="20"/>
+          <w:szCs w:val="20"/>
+        </w:rPr>
+        <w:t xml:space="preserve">La secuencia metodológica seguida es </w:t>
       </w:r>
     </w:p>
     <w:p>
       <w:pPr>
         <w:spacing w:after="0"/>
-        <w:rPr>
-          <w:b/>
-          <w:sz w:val="24"/>
-          <w:szCs w:val="24"/>
-        </w:rPr>
-      </w:pPr>
-    </w:p>
-    <w:p>
-      <w:pPr>
-        <w:rPr>
-          <w:rFonts w:eastAsia="Arial"/>
-          <w:sz w:val="20"/>
-          <w:szCs w:val="20"/>
-        </w:rPr>
-      </w:pPr>
-      <w:r>
-        <w:rPr>
-          <w:rFonts w:eastAsia="Arial"/>
-          <w:sz w:val="20"/>
-          <w:szCs w:val="20"/>
-        </w:rPr>
-        <w:t>I</w:t>
-      </w:r>
-      <w:r>
-        <w:rPr>
-          <w:rFonts w:eastAsia="Arial"/>
-          <w:b/>
-          <w:sz w:val="20"/>
-          <w:szCs w:val="20"/>
-        </w:rPr>
-        <w:t>ntroducción</w:t>
-      </w:r>
-      <w:r>
-        <w:rPr>
-          <w:rFonts w:eastAsia="Arial"/>
-          <w:sz w:val="20"/>
-          <w:szCs w:val="20"/>
-        </w:rPr>
-        <w:t xml:space="preserve">: </w:t>
-      </w:r>
-      <w:r>
-        <w:rPr>
-          <w:rFonts w:eastAsia="Arial"/>
-          <w:sz w:val="20"/>
-          <w:szCs w:val="20"/>
-        </w:rPr>
-        <w:t>Las tendencias tecnológicas han provocado acciones disruptivas en los procesos de enseñanza aprendizaje, por lo tanto, los docentes deben potenciar mucho más sus habilidades investigativas, en aras de construir escenarios más participativos, críticos, creativos, innovadores y cautivadores a través de metodologías de enseñanza como la Gamificación, referida a un constructo que refleja los elementos esenciales del pensamiento creativo, generando la permanencia exitosa en los procesos educativos</w:t>
-      </w:r>
-      <w:r>
-        <w:rPr>
-          <w:rFonts w:eastAsia="Arial"/>
-          <w:sz w:val="20"/>
-          <w:szCs w:val="20"/>
-        </w:rPr>
-        <w:t xml:space="preserve"> frente a un sistema que necesita estar a la vanguardia de la Sociedad de Red.</w:t>
-      </w:r>
-    </w:p>
-    <w:p>
-      <w:pPr>
-        <w:rPr>
-          <w:sz w:val="20"/>
-          <w:szCs w:val="20"/>
-        </w:rPr>
-      </w:pPr>
-      <w:r>
-        <w:rPr>
-          <w:rFonts w:eastAsia="Arial"/>
-          <w:b/>
-          <w:sz w:val="20"/>
-          <w:szCs w:val="20"/>
-        </w:rPr>
-        <w:t xml:space="preserve">Metodología: </w:t>
-      </w:r>
-      <w:r>
-        <w:rPr>
-          <w:rFonts w:eastAsia="Arial"/>
-          <w:sz w:val="20"/>
-          <w:szCs w:val="20"/>
-        </w:rPr>
-        <w:t xml:space="preserve">Razones por las cuales se llevó a cabo esta investigación de </w:t>
-      </w:r>
-      <w:r>
-        <w:rPr>
-          <w:sz w:val="20"/>
-          <w:szCs w:val="20"/>
-        </w:rPr>
-        <w:t>enfoque cuantitativo y de tipo descriptivo correlacional, con el uso de instrumentos de la Escala de Likert, diseñada con 30 preguntas, y  aplicada a 18 docentes del área de  filosofía de la básica primaria de la Institución Educativa Margarita Rojas de Cartagena Colombia, analizando dos variables de estudio, como la habilidad del pensamiento creativo desde la perspectiva de la Capacidad Inventiva, el Procesamiento de Información, Originalidad, Curiosidad, Flexibilidad, Fluidez, Comunicación e Iniciativa. Se propuso una estrategia pedagógica bajo el modelo instruccional ADDIE con talleres digitales y O</w:t>
-      </w:r>
-      <w:r>
-        <w:rPr>
-          <w:sz w:val="20"/>
-          <w:szCs w:val="20"/>
-        </w:rPr>
-        <w:t xml:space="preserve">bjetos Virtuales de Aprendizaje (OVA) </w:t>
-      </w:r>
-      <w:r>
-        <w:rPr>
-          <w:sz w:val="20"/>
-          <w:szCs w:val="20"/>
-        </w:rPr>
-        <w:t xml:space="preserve"> en la plataforma digital Exelearning</w:t>
-      </w:r>
-      <w:r>
-        <w:rPr>
-          <w:sz w:val="20"/>
-          <w:szCs w:val="20"/>
-        </w:rPr>
-        <w:t xml:space="preserve">, </w:t>
-      </w:r>
-      <w:r>
-        <w:rPr>
-          <w:sz w:val="20"/>
-          <w:szCs w:val="20"/>
-        </w:rPr>
-        <w:t>orientados bajo la Metodología de la Gamificación</w:t>
-      </w:r>
-      <w:r>
-        <w:rPr>
-          <w:sz w:val="20"/>
-          <w:szCs w:val="20"/>
-        </w:rPr>
-        <w:t xml:space="preserve"> y el uso de diferentes recursos digitales.</w:t>
-      </w:r>
-    </w:p>
-    <w:p>
-      <w:pPr>
-        <w:rPr>
-          <w:sz w:val="20"/>
-          <w:szCs w:val="20"/>
-        </w:rPr>
-      </w:pPr>
+        <w:ind w:firstLine="0"/>
+        <w:jc w:val="center"/>
+        <w:rPr>
+          <w:rFonts w:ascii="Arial" w:hAnsi="Arial" w:cs="Arial"/>
+          <w:b/>
+          <w:sz w:val="20"/>
+          <w:szCs w:val="20"/>
+        </w:rPr>
+      </w:pPr>
+      <w:r>
+        <w:rPr>
+          <w:rFonts w:ascii="Arial" w:hAnsi="Arial" w:cs="Arial"/>
+          <w:b/>
+          <w:sz w:val="20"/>
+          <w:szCs w:val="20"/>
+        </w:rPr>
+        <w:t xml:space="preserve">* Introducción a Python, </w:t>
+      </w:r>
+    </w:p>
+    <w:p>
+      <w:pPr>
+        <w:spacing w:after="0"/>
+        <w:ind w:firstLine="0"/>
+        <w:jc w:val="center"/>
+        <w:rPr>
+          <w:rFonts w:ascii="Arial" w:hAnsi="Arial" w:cs="Arial"/>
+          <w:b/>
+          <w:sz w:val="20"/>
+          <w:szCs w:val="20"/>
+        </w:rPr>
+      </w:pPr>
+      <w:r>
+        <w:rPr>
+          <w:rFonts w:ascii="Arial" w:hAnsi="Arial" w:cs="Arial"/>
+          <w:b/>
+          <w:sz w:val="20"/>
+          <w:szCs w:val="20"/>
+        </w:rPr>
+        <w:t xml:space="preserve">* estadística para ciencia de datos, </w:t>
+      </w:r>
+    </w:p>
+    <w:p>
+      <w:pPr>
+        <w:spacing w:after="0"/>
+        <w:ind w:firstLine="0"/>
+        <w:jc w:val="center"/>
+        <w:rPr>
+          <w:rFonts w:ascii="Arial" w:hAnsi="Arial" w:cs="Arial"/>
+          <w:b/>
+          <w:sz w:val="20"/>
+          <w:szCs w:val="20"/>
+        </w:rPr>
+      </w:pPr>
+      <w:r>
+        <w:rPr>
+          <w:rFonts w:ascii="Arial" w:hAnsi="Arial" w:cs="Arial"/>
+          <w:b/>
+          <w:sz w:val="20"/>
+          <w:szCs w:val="20"/>
+        </w:rPr>
+        <w:t>* regresión y</w:t>
+      </w:r>
+    </w:p>
+    <w:p>
+      <w:pPr>
+        <w:spacing w:after="0"/>
+        <w:ind w:firstLine="0"/>
+        <w:jc w:val="center"/>
+        <w:rPr>
+          <w:rFonts w:ascii="Arial" w:hAnsi="Arial" w:cs="Arial"/>
+          <w:b/>
+          <w:sz w:val="20"/>
+          <w:szCs w:val="20"/>
+        </w:rPr>
+      </w:pPr>
+      <w:r>
+        <w:rPr>
+          <w:rFonts w:ascii="Arial" w:hAnsi="Arial" w:cs="Arial"/>
+          <w:b/>
+          <w:sz w:val="20"/>
+          <w:szCs w:val="20"/>
+        </w:rPr>
+        <w:t xml:space="preserve">* clasificación.  </w:t>
+      </w:r>
+    </w:p>
+    <w:p>
+      <w:pPr>
+        <w:spacing w:after="0"/>
+        <w:ind w:firstLine="0"/>
+        <w:jc w:val="center"/>
+        <w:rPr>
+          <w:rFonts w:ascii="Arial" w:hAnsi="Arial" w:cs="Arial"/>
+          <w:b/>
+          <w:sz w:val="20"/>
+          <w:szCs w:val="20"/>
+        </w:rPr>
+      </w:pPr>
+      <w:r>
+        <w:rPr>
+          <w:rFonts w:ascii="Arial" w:hAnsi="Arial" w:cs="Arial"/>
+          <w:b/>
+          <w:sz w:val="20"/>
+          <w:szCs w:val="20"/>
+        </w:rPr>
+        <w:t xml:space="preserve">Como resultado de esta estrategia didáctica, los estudiantes:  </w:t>
+      </w:r>
+    </w:p>
+    <w:p>
+      <w:pPr>
+        <w:pStyle w:val="ListParagraph"/>
+        <w:numPr>
+          <w:ilvl w:val="0"/>
+          <w:numId w:val="3"/>
+        </w:numPr>
+        <w:spacing w:after="0"/>
+        <w:jc w:val="center"/>
+        <w:rPr>
+          <w:rFonts w:ascii="Arial" w:hAnsi="Arial" w:cs="Arial"/>
+          <w:b/>
+          <w:sz w:val="20"/>
+          <w:szCs w:val="20"/>
+        </w:rPr>
+      </w:pPr>
+      <w:r>
+        <w:rPr>
+          <w:rFonts w:ascii="Arial" w:hAnsi="Arial" w:cs="Arial"/>
+          <w:b/>
+          <w:sz w:val="20"/>
+          <w:szCs w:val="20"/>
+        </w:rPr>
+        <w:t xml:space="preserve">Los estudiantes desarrollaron habilidades para obtener un </w:t>
+      </w:r>
       <w:proofErr w:type="spellStart"/>
-      <w:proofErr w:type="gramStart"/>
-      <w:r>
-        <w:rPr>
-          <w:b/>
-          <w:sz w:val="20"/>
-          <w:szCs w:val="20"/>
-        </w:rPr>
-        <w:t>Resultados</w:t>
-      </w:r>
-      <w:r>
-        <w:rPr>
-          <w:sz w:val="20"/>
-          <w:szCs w:val="20"/>
-        </w:rPr>
-        <w:t>:</w:t>
-      </w:r>
-      <w:r>
-        <w:rPr>
-          <w:sz w:val="20"/>
-          <w:szCs w:val="20"/>
-        </w:rPr>
-        <w:t>Los</w:t>
+      <w:r>
+        <w:rPr>
+          <w:rFonts w:ascii="Arial" w:hAnsi="Arial" w:cs="Arial"/>
+          <w:b/>
+          <w:sz w:val="20"/>
+          <w:szCs w:val="20"/>
+        </w:rPr>
+        <w:t>dataset</w:t>
       </w:r>
       <w:proofErr w:type="spellEnd"/>
-      <w:proofErr w:type="gramEnd"/>
-      <w:r>
-        <w:rPr>
-          <w:sz w:val="20"/>
-          <w:szCs w:val="20"/>
-        </w:rPr>
-        <w:t xml:space="preserve"> análisis de los resultados se hicieron bajo instrumentos de Escala de Likert y la Técnica del Pre test y Pos test. Se evidenció que el 89% de la población objeto de estudio presenta fragilidades en los diferentes elementos que integran la habilidad del pensamiento creativo desde la perspectiva de la Capacidad Inventiva, el Procesamiento de Información, Originalidad, Curiosidad, Flexibilidad, Fluidez, Comunicación e Iniciativa. Igualmente, en el estudio se encontraron fortalezas como la dinamización del estilo pedagógico, la transversalización curricular a través del modelo instruccional ADDIE, con escenarios que detonaron gran acogida</w:t>
-      </w:r>
-      <w:r>
-        <w:rPr>
-          <w:sz w:val="20"/>
-          <w:szCs w:val="20"/>
-        </w:rPr>
-        <w:t xml:space="preserve"> y replicabilidad en los dife</w:t>
-      </w:r>
-      <w:r>
-        <w:rPr>
-          <w:sz w:val="20"/>
-          <w:szCs w:val="20"/>
-        </w:rPr>
-        <w:t>rentes contextos</w:t>
-      </w:r>
-      <w:r>
-        <w:rPr>
-          <w:sz w:val="20"/>
-          <w:szCs w:val="20"/>
-        </w:rPr>
-        <w:t xml:space="preserve"> educativos.</w:t>
-      </w:r>
-    </w:p>
-    <w:p>
-      <w:pPr>
-        <w:rPr>
-          <w:sz w:val="20"/>
-          <w:szCs w:val="20"/>
-        </w:rPr>
-      </w:pPr>
-      <w:r>
-        <w:rPr>
-          <w:b/>
-          <w:sz w:val="20"/>
-          <w:szCs w:val="20"/>
-        </w:rPr>
-        <w:t>Conclusiones:</w:t>
-      </w:r>
-      <w:r>
-        <w:rPr>
-          <w:sz w:val="20"/>
-          <w:szCs w:val="20"/>
+      <w:r>
+        <w:rPr>
+          <w:rFonts w:ascii="Arial" w:hAnsi="Arial" w:cs="Arial"/>
+          <w:b/>
+          <w:sz w:val="20"/>
+          <w:szCs w:val="20"/>
+        </w:rPr>
+        <w:t xml:space="preserve"> asociado a un problema investigativo o empresarial.  </w:t>
+      </w:r>
+    </w:p>
+    <w:p>
+      <w:pPr>
+        <w:pStyle w:val="ListParagraph"/>
+        <w:numPr>
+          <w:ilvl w:val="0"/>
+          <w:numId w:val="3"/>
+        </w:numPr>
+        <w:spacing w:after="0"/>
+        <w:jc w:val="center"/>
+        <w:rPr>
+          <w:rFonts w:ascii="Arial" w:hAnsi="Arial" w:cs="Arial"/>
+          <w:b/>
+          <w:sz w:val="20"/>
+          <w:szCs w:val="20"/>
+        </w:rPr>
+      </w:pPr>
+      <w:r>
+        <w:rPr>
+          <w:rFonts w:ascii="Arial" w:hAnsi="Arial" w:cs="Arial"/>
+          <w:b/>
+          <w:sz w:val="20"/>
+          <w:szCs w:val="20"/>
+        </w:rPr>
+        <w:t xml:space="preserve">2. Constituyeron un modelo predictivo de Machine </w:t>
+      </w:r>
+      <w:proofErr w:type="spellStart"/>
+      <w:r>
+        <w:rPr>
+          <w:rFonts w:ascii="Arial" w:hAnsi="Arial" w:cs="Arial"/>
+          <w:b/>
+          <w:sz w:val="20"/>
+          <w:szCs w:val="20"/>
+        </w:rPr>
+        <w:t>Learning</w:t>
+      </w:r>
+      <w:proofErr w:type="spellEnd"/>
+      <w:r>
+        <w:rPr>
+          <w:rFonts w:ascii="Arial" w:hAnsi="Arial" w:cs="Arial"/>
+          <w:b/>
+          <w:sz w:val="20"/>
+          <w:szCs w:val="20"/>
+        </w:rPr>
+        <w:t xml:space="preserve"> para realizar una tarea de regresión o de clasificación estimando su desempeño o poder de generalización. Estuvieron en capacidad de justificar la forma en que configuran su modelo.  </w:t>
+      </w:r>
+    </w:p>
+    <w:p>
+      <w:pPr>
+        <w:pStyle w:val="ListParagraph"/>
+        <w:numPr>
+          <w:ilvl w:val="0"/>
+          <w:numId w:val="3"/>
+        </w:numPr>
+        <w:spacing w:after="0"/>
+        <w:jc w:val="center"/>
+        <w:rPr>
+          <w:rFonts w:ascii="Arial" w:hAnsi="Arial" w:cs="Arial"/>
+          <w:b/>
+          <w:sz w:val="20"/>
+          <w:szCs w:val="20"/>
+        </w:rPr>
+      </w:pPr>
+      <w:r>
+        <w:rPr>
+          <w:rFonts w:ascii="Arial" w:hAnsi="Arial" w:cs="Arial"/>
+          <w:b/>
+          <w:sz w:val="20"/>
+          <w:szCs w:val="20"/>
+        </w:rPr>
+        <w:t xml:space="preserve">3. Lograron presentar  el proceso de su construcción del modelo y lo </w:t>
+      </w:r>
+      <w:r>
+        <w:rPr>
+          <w:rFonts w:ascii="Arial" w:hAnsi="Arial" w:cs="Arial"/>
+          <w:b/>
+          <w:sz w:val="20"/>
+          <w:szCs w:val="20"/>
+        </w:rPr>
+        <w:t>expusieron</w:t>
+      </w:r>
+      <w:r>
+        <w:rPr>
+          <w:rFonts w:ascii="Arial" w:hAnsi="Arial" w:cs="Arial"/>
+          <w:b/>
+          <w:sz w:val="20"/>
+          <w:szCs w:val="20"/>
+        </w:rPr>
+        <w:t xml:space="preserve">, con las interpretaciones de las predicciones, y establecieron algunas limitaciones y potencialidades del modelo que constituyeron.  Los estudiantes de las seccionales de la Universidad de Antioquia a lo largo del departamento, pudieron  acceder a estos conocimientos porque estos productos de aprendizaje se pueden ofertar de manera libre y gratuita siguiendo la política de ciencia abierta en:  </w:t>
+      </w:r>
+    </w:p>
+    <w:p>
+      <w:pPr>
+        <w:pStyle w:val="ListParagraph"/>
+        <w:numPr>
+          <w:ilvl w:val="0"/>
+          <w:numId w:val="3"/>
+        </w:numPr>
+        <w:spacing w:after="0"/>
+        <w:jc w:val="center"/>
+        <w:rPr>
+          <w:rFonts w:ascii="Arial" w:hAnsi="Arial" w:cs="Arial"/>
+          <w:b/>
+          <w:sz w:val="20"/>
+          <w:szCs w:val="20"/>
+        </w:rPr>
+      </w:pPr>
+      <w:hyperlink r:id="rId10" w:history="1">
+        <w:r>
+          <w:rPr>
+            <w:rStyle w:val="Hyperlink"/>
+            <w:rFonts w:ascii="Arial" w:hAnsi="Arial" w:cs="Arial"/>
+            <w:b/>
+            <w:sz w:val="20"/>
+            <w:szCs w:val="20"/>
+          </w:rPr>
+          <w:t>https://github.com/marco-canas/7_didactica_ciencia_datos/tree/main/propuesta/unidad_didac</w:t>
+        </w:r>
+      </w:hyperlink>
+      <w:r>
+        <w:rPr>
+          <w:rFonts w:ascii="Arial" w:hAnsi="Arial" w:cs="Arial"/>
+          <w:b/>
+          <w:sz w:val="20"/>
+          <w:szCs w:val="20"/>
+        </w:rPr>
+        <w:t>.</w:t>
+      </w:r>
+    </w:p>
+    <w:p>
+      <w:pPr>
+        <w:pStyle w:val="ListParagraph"/>
+        <w:numPr>
+          <w:ilvl w:val="0"/>
+          <w:numId w:val="3"/>
+        </w:numPr>
+        <w:spacing w:after="0"/>
+        <w:jc w:val="center"/>
+        <w:rPr>
+          <w:rFonts w:ascii="Arial" w:hAnsi="Arial" w:cs="Arial"/>
+          <w:b/>
+          <w:sz w:val="20"/>
+          <w:szCs w:val="20"/>
+        </w:rPr>
+      </w:pPr>
+      <w:r>
+        <w:rPr>
+          <w:rFonts w:ascii="Arial" w:hAnsi="Arial" w:cs="Arial"/>
+          <w:b/>
+          <w:sz w:val="20"/>
+          <w:szCs w:val="20"/>
+        </w:rPr>
+        <w:t xml:space="preserve">Nuestra propuesta de enseñanza y aprendizaje es apropiada pues configura un entorno de aprendizaje que conjuga las aplicaciones: Google </w:t>
+      </w:r>
+      <w:proofErr w:type="spellStart"/>
+      <w:r>
+        <w:rPr>
+          <w:rFonts w:ascii="Arial" w:hAnsi="Arial" w:cs="Arial"/>
+          <w:b/>
+          <w:sz w:val="20"/>
+          <w:szCs w:val="20"/>
+        </w:rPr>
+        <w:t>Colab</w:t>
+      </w:r>
+      <w:proofErr w:type="spellEnd"/>
+      <w:r>
+        <w:rPr>
+          <w:rFonts w:ascii="Arial" w:hAnsi="Arial" w:cs="Arial"/>
+          <w:b/>
+          <w:sz w:val="20"/>
+          <w:szCs w:val="20"/>
+        </w:rPr>
+        <w:t xml:space="preserve">, GitHub y YouTube que están vinculadas al sector privado y a la cotidianidad. </w:t>
+      </w:r>
+    </w:p>
+    <w:p>
+      <w:pPr>
+        <w:pStyle w:val="ListParagraph"/>
+        <w:spacing w:after="0"/>
+        <w:ind w:firstLine="0"/>
+        <w:rPr>
+          <w:rFonts w:ascii="Arial" w:hAnsi="Arial" w:cs="Arial"/>
+          <w:b/>
+          <w:sz w:val="20"/>
+          <w:szCs w:val="20"/>
+        </w:rPr>
+      </w:pPr>
+      <w:r>
+        <w:rPr>
+          <w:noProof/>
+        </w:rPr>
+        <w:lastRenderedPageBreak/>
+        <w:drawing>
+          <wp:inline distT="0" distB="0" distL="0" distR="0" wp14:anchorId="3AD890A3" wp14:editId="43B37A97">
+            <wp:extent cx="5971540" cy="3359150"/>
+            <wp:effectExtent l="0" t="0" r="0" b="0"/>
+            <wp:docPr id="1366436870" name="Picture 1" descr="Google Colab - Post Notebooks to a GitHub Repository!"/>
+            <wp:cNvGraphicFramePr>
+              <a:graphicFrameLocks xmlns:a="http://schemas.openxmlformats.org/drawingml/2006/main" noChangeAspect="1"/>
+            </wp:cNvGraphicFramePr>
+            <a:graphic xmlns:a="http://schemas.openxmlformats.org/drawingml/2006/main">
+              <a:graphicData uri="http://schemas.openxmlformats.org/drawingml/2006/picture">
+                <pic:pic xmlns:pic="http://schemas.openxmlformats.org/drawingml/2006/picture">
+                  <pic:nvPicPr>
+                    <pic:cNvPr id="0" name="Picture 1" descr="Google Colab - Post Notebooks to a GitHub Repository!"/>
+                    <pic:cNvPicPr>
+                      <a:picLocks noChangeAspect="1" noChangeArrowheads="1"/>
+                    </pic:cNvPicPr>
+                  </pic:nvPicPr>
+                  <pic:blipFill>
+                    <a:blip r:embed="rId11">
+                      <a:extLst>
+                        <a:ext uri="{28A0092B-C50C-407E-A947-70E740481C1C}">
+                          <a14:useLocalDpi xmlns:a14="http://schemas.microsoft.com/office/drawing/2010/main" val="0"/>
+                        </a:ext>
+                      </a:extLst>
+                    </a:blip>
+                    <a:srcRect/>
+                    <a:stretch>
+                      <a:fillRect/>
+                    </a:stretch>
+                  </pic:blipFill>
+                  <pic:spPr bwMode="auto">
+                    <a:xfrm>
+                      <a:off x="0" y="0"/>
+                      <a:ext cx="5971540" cy="3359150"/>
+                    </a:xfrm>
+                    <a:prstGeom prst="rect">
+                      <a:avLst/>
+                    </a:prstGeom>
+                    <a:noFill/>
+                    <a:ln>
+                      <a:noFill/>
+                    </a:ln>
+                  </pic:spPr>
+                </pic:pic>
+              </a:graphicData>
+            </a:graphic>
+          </wp:inline>
+        </w:drawing>
+      </w:r>
+    </w:p>
+    <w:p>
+      <w:pPr>
+        <w:pStyle w:val="ListParagraph"/>
+        <w:spacing w:after="0"/>
+        <w:ind w:firstLine="0"/>
+        <w:rPr>
+          <w:rFonts w:ascii="Arial" w:hAnsi="Arial" w:cs="Arial"/>
+          <w:b/>
+          <w:sz w:val="20"/>
+          <w:szCs w:val="20"/>
+          <w:lang w:val="en-US"/>
+        </w:rPr>
+      </w:pPr>
+      <w:r>
+        <w:rPr>
+          <w:noProof/>
+        </w:rPr>
+        <w:drawing>
+          <wp:inline distT="0" distB="0" distL="0" distR="0" wp14:anchorId="6C262DAC" wp14:editId="61CC46AA">
+            <wp:extent cx="5971540" cy="3355340"/>
+            <wp:effectExtent l="0" t="0" r="0" b="0"/>
+            <wp:docPr id="183531957" name="Picture 2"/>
+            <wp:cNvGraphicFramePr>
+              <a:graphicFrameLocks xmlns:a="http://schemas.openxmlformats.org/drawingml/2006/main" noChangeAspect="1"/>
+            </wp:cNvGraphicFramePr>
+            <a:graphic xmlns:a="http://schemas.openxmlformats.org/drawingml/2006/main">
+              <a:graphicData uri="http://schemas.openxmlformats.org/drawingml/2006/picture">
+                <pic:pic xmlns:pic="http://schemas.openxmlformats.org/drawingml/2006/picture">
+                  <pic:nvPicPr>
+                    <pic:cNvPr id="0" name="Picture 3"/>
+                    <pic:cNvPicPr>
+                      <a:picLocks noChangeAspect="1" noChangeArrowheads="1"/>
+                    </pic:cNvPicPr>
+                  </pic:nvPicPr>
+                  <pic:blipFill>
+                    <a:blip r:embed="rId12">
+                      <a:extLst>
+                        <a:ext uri="{28A0092B-C50C-407E-A947-70E740481C1C}">
+                          <a14:useLocalDpi xmlns:a14="http://schemas.microsoft.com/office/drawing/2010/main" val="0"/>
+                        </a:ext>
+                      </a:extLst>
+                    </a:blip>
+                    <a:srcRect/>
+                    <a:stretch>
+                      <a:fillRect/>
+                    </a:stretch>
+                  </pic:blipFill>
+                  <pic:spPr bwMode="auto">
+                    <a:xfrm>
+                      <a:off x="0" y="0"/>
+                      <a:ext cx="5971540" cy="3355340"/>
+                    </a:xfrm>
+                    <a:prstGeom prst="rect">
+                      <a:avLst/>
+                    </a:prstGeom>
+                    <a:noFill/>
+                    <a:ln>
+                      <a:noFill/>
+                    </a:ln>
+                  </pic:spPr>
+                </pic:pic>
+              </a:graphicData>
+            </a:graphic>
+          </wp:inline>
+        </w:drawing>
+      </w:r>
+      <w:r>
+        <w:rPr>
+          <w:rFonts w:ascii="Arial" w:hAnsi="Arial" w:cs="Arial"/>
+          <w:b/>
+          <w:sz w:val="20"/>
+          <w:szCs w:val="20"/>
+          <w:lang w:val="en-US"/>
         </w:rPr>
         <w:t xml:space="preserve"> </w:t>
       </w:r>
-      <w:r>
-        <w:rPr>
-          <w:sz w:val="20"/>
-          <w:szCs w:val="20"/>
-        </w:rPr>
-        <w:t xml:space="preserve">El estudio mostró un cambio significativo en los docentes, el 95% lograron fortalecer la habilidad del pensamiento creativo. Se recomienda una reestructuración del PEI con inclusión de </w:t>
-      </w:r>
-      <w:r>
-        <w:rPr>
-          <w:sz w:val="20"/>
-          <w:szCs w:val="20"/>
-        </w:rPr>
-        <w:t xml:space="preserve">plataformas digitales, </w:t>
-      </w:r>
-      <w:r>
-        <w:rPr>
-          <w:sz w:val="20"/>
-          <w:szCs w:val="20"/>
-        </w:rPr>
-        <w:t xml:space="preserve">recursos digitales y el uso de la Metodología de </w:t>
-      </w:r>
-      <w:r>
-        <w:rPr>
-          <w:sz w:val="20"/>
-          <w:szCs w:val="20"/>
-        </w:rPr>
-        <w:t xml:space="preserve">enseñanza enmarcada en </w:t>
-      </w:r>
-      <w:r>
-        <w:rPr>
-          <w:sz w:val="20"/>
-          <w:szCs w:val="20"/>
-        </w:rPr>
-        <w:t xml:space="preserve">la Gamificación </w:t>
-      </w:r>
-      <w:r>
-        <w:rPr>
-          <w:sz w:val="20"/>
-          <w:szCs w:val="20"/>
-        </w:rPr>
-        <w:t xml:space="preserve">de los procesos de </w:t>
-      </w:r>
-      <w:r>
-        <w:rPr>
-          <w:sz w:val="20"/>
-          <w:szCs w:val="20"/>
-        </w:rPr>
-        <w:t>aprendizaje</w:t>
-      </w:r>
-      <w:r>
-        <w:rPr>
-          <w:sz w:val="20"/>
-          <w:szCs w:val="20"/>
-        </w:rPr>
-        <w:t>, desde</w:t>
-      </w:r>
-      <w:r>
-        <w:rPr>
-          <w:sz w:val="20"/>
-          <w:szCs w:val="20"/>
-        </w:rPr>
-        <w:t xml:space="preserve"> Talleres de formación tecno pedagógica a los docentes, apuntando a una educación </w:t>
-      </w:r>
-      <w:r>
-        <w:rPr>
-          <w:sz w:val="20"/>
-          <w:szCs w:val="20"/>
-        </w:rPr>
-        <w:t xml:space="preserve">didáctica, creativa, emotiva, </w:t>
-      </w:r>
-      <w:r>
-        <w:rPr>
-          <w:sz w:val="20"/>
-          <w:szCs w:val="20"/>
-        </w:rPr>
-        <w:t xml:space="preserve">sostenible y de calidad académica.  </w:t>
-      </w:r>
+    </w:p>
+    <w:p>
+      <w:pPr>
+        <w:spacing w:after="0"/>
+        <w:rPr>
+          <w:b/>
+          <w:sz w:val="24"/>
+          <w:szCs w:val="24"/>
+          <w:lang w:val="en-US"/>
+        </w:rPr>
+      </w:pPr>
     </w:p>
     <w:p>
       <w:pPr>
@@ -1582,7 +1441,7 @@
     </w:p>
     <w:p>
       <w:pPr>
-        <w:pStyle w:val="Prrafodelista"/>
+        <w:pStyle w:val="ListParagraph"/>
         <w:numPr>
           <w:ilvl w:val="0"/>
           <w:numId w:val="1"/>
@@ -1605,14 +1464,13 @@
           <w:sz w:val="40"/>
           <w:szCs w:val="40"/>
         </w:rPr>
-        <w:lastRenderedPageBreak/>
         <w:t>Abstract</w:t>
       </w:r>
       <w:proofErr w:type="spellEnd"/>
     </w:p>
     <w:p>
       <w:pPr>
-        <w:pStyle w:val="Prrafodelista"/>
+        <w:pStyle w:val="ListParagraph"/>
         <w:spacing w:line="276" w:lineRule="auto"/>
         <w:ind w:firstLine="0"/>
         <w:contextualSpacing/>
@@ -1631,32 +1489,12 @@
           <w:sz w:val="40"/>
           <w:szCs w:val="40"/>
         </w:rPr>
-        <w:t xml:space="preserve">El </w:t>
-      </w:r>
-      <w:proofErr w:type="gramStart"/>
-      <w:r>
-        <w:rPr>
-          <w:b/>
-          <w:bCs/>
-          <w:sz w:val="40"/>
-          <w:szCs w:val="40"/>
-        </w:rPr>
-        <w:t>resumen  se</w:t>
-      </w:r>
-      <w:proofErr w:type="gramEnd"/>
-      <w:r>
-        <w:rPr>
-          <w:b/>
-          <w:bCs/>
-          <w:sz w:val="40"/>
-          <w:szCs w:val="40"/>
-        </w:rPr>
-        <w:t xml:space="preserve"> traduce en inglés.</w:t>
-      </w:r>
-    </w:p>
-    <w:p>
-      <w:pPr>
-        <w:pStyle w:val="Prrafodelista"/>
+        <w:t>El resumen  se traduce en inglés.</w:t>
+      </w:r>
+    </w:p>
+    <w:p>
+      <w:pPr>
+        <w:pStyle w:val="ListParagraph"/>
         <w:spacing w:line="276" w:lineRule="auto"/>
         <w:ind w:firstLine="0"/>
         <w:contextualSpacing/>
@@ -1671,7 +1509,7 @@
     </w:p>
     <w:p>
       <w:pPr>
-        <w:pStyle w:val="Prrafodelista"/>
+        <w:pStyle w:val="ListParagraph"/>
         <w:spacing w:line="276" w:lineRule="auto"/>
         <w:ind w:firstLine="0"/>
         <w:contextualSpacing/>
@@ -1686,7 +1524,7 @@
     </w:p>
     <w:p>
       <w:pPr>
-        <w:pStyle w:val="Prrafodelista"/>
+        <w:pStyle w:val="ListParagraph"/>
         <w:numPr>
           <w:ilvl w:val="0"/>
           <w:numId w:val="1"/>
@@ -1847,7 +1685,17 @@
           <w:sz w:val="24"/>
           <w:szCs w:val="24"/>
         </w:rPr>
-        <w:t xml:space="preserve">  Se hace necesario fortalecer estos procesos a través de las TIC acordes con las necesidades de los estudiantes y a su contexto con el objetivo de orientarlos a una asimilación de los conceptos que les permita el desarrollo de la competencia de la resolución de problemas en el balanceo de ecuaciones químicas de tal forma que sea significativo para el estudiante, para los estudiantes de la Institución Educativa Jorge Eliecer Gaitán de restrepo valle del Cauca. Ya que los resultados se reflejan en la figura tomadas de las pruebas saber Valle 2021.</w:t>
+        <w:t xml:space="preserve">  Se hace necesario fortalecer estos procesos a través de las TIC acordes con las necesidades de los estudiantes y a su contexto con el objetivo de orientarlos a una asimilación de los conceptos que les permita el desarrollo de la competencia de la resolución de problemas en el balanceo de ecuaciones químicas de tal forma que sea significativo para el estudiante, para los estudiantes de </w:t>
+      </w:r>
+      <w:r>
+        <w:rPr>
+          <w:rFonts w:eastAsia="Arial"/>
+          <w:bCs/>
+          <w:sz w:val="24"/>
+          <w:szCs w:val="24"/>
+        </w:rPr>
+        <w:lastRenderedPageBreak/>
+        <w:t>la Institución Educativa Jorge Eliecer Gaitán de restrepo valle del Cauca. Ya que los resultados se reflejan en la figura tomadas de las pruebas saber Valle 2021.</w:t>
       </w:r>
     </w:p>
     <w:p>
@@ -1855,7 +1703,6 @@
         <w:spacing w:line="360" w:lineRule="auto"/>
       </w:pPr>
       <w:r>
-        <w:lastRenderedPageBreak/>
         <w:t xml:space="preserve">  La propuesta de crear una App de modo innovador empleando recursos digitales como dispositivos móviles tipo smartphone que permitan la generación de destrezas y habilidades en los estudiantes para el desarrollo de la competencia a fortalecer, para enfrentar los retos de la sociedad.</w:t>
       </w:r>
     </w:p>
@@ -1924,7 +1771,7 @@
                     </pic:cNvPicPr>
                   </pic:nvPicPr>
                   <pic:blipFill>
-                    <a:blip r:embed="rId10">
+                    <a:blip r:embed="rId13">
                       <a:extLst>
                         <a:ext uri="{28A0092B-C50C-407E-A947-70E740481C1C}">
                           <a14:useLocalDpi xmlns:a14="http://schemas.microsoft.com/office/drawing/2010/main" val="0"/>
@@ -2090,7 +1937,7 @@
     </w:p>
     <w:p>
       <w:pPr>
-        <w:pStyle w:val="Prrafodelista"/>
+        <w:pStyle w:val="ListParagraph"/>
         <w:numPr>
           <w:ilvl w:val="0"/>
           <w:numId w:val="1"/>
@@ -2112,12 +1959,13 @@
           <w:sz w:val="40"/>
           <w:szCs w:val="40"/>
         </w:rPr>
+        <w:lastRenderedPageBreak/>
         <w:t>Metodología</w:t>
       </w:r>
     </w:p>
     <w:p>
       <w:pPr>
-        <w:pStyle w:val="Prrafodelista"/>
+        <w:pStyle w:val="ListParagraph"/>
         <w:spacing w:line="276" w:lineRule="auto"/>
         <w:ind w:firstLine="0"/>
         <w:contextualSpacing/>
@@ -2131,7 +1979,7 @@
     </w:p>
     <w:p>
       <w:pPr>
-        <w:pStyle w:val="Prrafodelista"/>
+        <w:pStyle w:val="ListParagraph"/>
         <w:spacing w:line="276" w:lineRule="auto"/>
         <w:ind w:firstLine="0"/>
         <w:contextualSpacing/>
@@ -2148,7 +1996,6 @@
           <w:sz w:val="24"/>
           <w:szCs w:val="24"/>
         </w:rPr>
-        <w:lastRenderedPageBreak/>
         <w:t>Plantea con claridad el enfoque, el diseño de la investigación, las técnicas e instrumentos utilizados. Caracteriza a la    población     de     participantes, aborda las variables o categorías. Da muestras de un tratamiento ético de la información que así lo requiera</w:t>
       </w:r>
       <w:r>
@@ -2163,7 +2010,7 @@
     </w:p>
     <w:p>
       <w:pPr>
-        <w:pStyle w:val="Prrafodelista"/>
+        <w:pStyle w:val="ListParagraph"/>
         <w:spacing w:line="276" w:lineRule="auto"/>
         <w:ind w:firstLine="0"/>
         <w:contextualSpacing/>
@@ -2186,7 +2033,7 @@
     </w:p>
     <w:p>
       <w:pPr>
-        <w:pStyle w:val="Prrafodelista"/>
+        <w:pStyle w:val="ListParagraph"/>
         <w:spacing w:line="276" w:lineRule="auto"/>
         <w:ind w:firstLine="0"/>
         <w:contextualSpacing/>
@@ -2344,7 +2191,17 @@
           <w:sz w:val="24"/>
           <w:szCs w:val="24"/>
         </w:rPr>
-        <w:t xml:space="preserve"> para el análisis de cada pregunta, por lo que se tabula los datos utilizando el software de Microsoft Excel, para organizar la información y determinar el porcentaje con el fin de graficar, cuidando que no se cometan errores al digitar la información, por lo que se cuenta con datos necesarios para realizar análisis y comparaciones de acuerdo a las gráficas obtenidas. También se emplea los datos y las gráficas arrojados por el formulario Google.</w:t>
+        <w:t xml:space="preserve"> para el análisis de cada pregunta, por lo que se tabula los datos utilizando el software de Microsoft Excel, para organizar la información y determinar el porcentaje con el fin de graficar, cuidando que no se cometan errores al digitar la información, por lo que se cuenta con datos necesarios para realizar </w:t>
+      </w:r>
+      <w:r>
+        <w:rPr>
+          <w:rFonts w:eastAsia="Arial"/>
+          <w:iCs/>
+          <w:sz w:val="24"/>
+          <w:szCs w:val="24"/>
+        </w:rPr>
+        <w:lastRenderedPageBreak/>
+        <w:t>análisis y comparaciones de acuerdo a las gráficas obtenidas. También se emplea los datos y las gráficas arrojados por el formulario Google.</w:t>
       </w:r>
     </w:p>
     <w:p>
@@ -2367,7 +2224,6 @@
           <w:sz w:val="24"/>
           <w:szCs w:val="24"/>
         </w:rPr>
-        <w:lastRenderedPageBreak/>
         <w:t xml:space="preserve">  El empleo del aplicativo móvil Lin _</w:t>
       </w:r>
       <w:proofErr w:type="spellStart"/>
@@ -2800,7 +2656,7 @@
                 <w:rFonts w:ascii="Times New Roman" w:hAnsi="Times New Roman"/>
                 <w:szCs w:val="24"/>
               </w:rPr>
-              <w:t xml:space="preserve"> y utilidad a través de un cuestionario que consta de 15 ítems, empleando formato Google, los resultados de la encuesta de usuario serán de </w:t>
+              <w:t xml:space="preserve"> y </w:t>
             </w:r>
             <w:r>
               <w:rPr>
@@ -2808,7 +2664,7 @@
                 <w:szCs w:val="24"/>
               </w:rPr>
               <w:lastRenderedPageBreak/>
-              <w:t>gran utilidad para determinar las recomendaciones o ajustes a realizar en la App</w:t>
+              <w:t>utilidad a través de un cuestionario que consta de 15 ítems, empleando formato Google, los resultados de la encuesta de usuario serán de gran utilidad para determinar las recomendaciones o ajustes a realizar en la App</w:t>
             </w:r>
           </w:p>
         </w:tc>
@@ -2988,7 +2844,7 @@
                     </pic:cNvPicPr>
                   </pic:nvPicPr>
                   <pic:blipFill>
-                    <a:blip r:embed="rId11">
+                    <a:blip r:embed="rId14">
                       <a:extLst>
                         <a:ext uri="{28A0092B-C50C-407E-A947-70E740481C1C}">
                           <a14:useLocalDpi xmlns:a14="http://schemas.microsoft.com/office/drawing/2010/main" val="0"/>
@@ -3112,7 +2968,7 @@
     </w:p>
     <w:p>
       <w:pPr>
-        <w:pStyle w:val="Prrafodelista"/>
+        <w:pStyle w:val="ListParagraph"/>
         <w:spacing w:line="276" w:lineRule="auto"/>
         <w:ind w:firstLine="0"/>
         <w:contextualSpacing/>
@@ -3126,7 +2982,7 @@
     </w:p>
     <w:p>
       <w:pPr>
-        <w:pStyle w:val="Prrafodelista"/>
+        <w:pStyle w:val="ListParagraph"/>
         <w:spacing w:line="276" w:lineRule="auto"/>
         <w:ind w:firstLine="0"/>
         <w:contextualSpacing/>
@@ -3140,7 +2996,7 @@
     </w:p>
     <w:p>
       <w:pPr>
-        <w:pStyle w:val="Prrafodelista"/>
+        <w:pStyle w:val="ListParagraph"/>
         <w:numPr>
           <w:ilvl w:val="0"/>
           <w:numId w:val="1"/>
@@ -3167,7 +3023,7 @@
     </w:p>
     <w:p>
       <w:pPr>
-        <w:pStyle w:val="Prrafodelista"/>
+        <w:pStyle w:val="ListParagraph"/>
         <w:spacing w:line="276" w:lineRule="auto"/>
         <w:ind w:firstLine="0"/>
         <w:contextualSpacing/>
@@ -3475,7 +3331,7 @@
                     </pic:cNvPicPr>
                   </pic:nvPicPr>
                   <pic:blipFill>
-                    <a:blip r:embed="rId12">
+                    <a:blip r:embed="rId15">
                       <a:extLst>
                         <a:ext uri="{28A0092B-C50C-407E-A947-70E740481C1C}">
                           <a14:useLocalDpi xmlns:a14="http://schemas.microsoft.com/office/drawing/2010/main" val="0"/>
@@ -3567,7 +3423,7 @@
                     </pic:cNvPicPr>
                   </pic:nvPicPr>
                   <pic:blipFill>
-                    <a:blip r:embed="rId13">
+                    <a:blip r:embed="rId16">
                       <a:extLst>
                         <a:ext uri="{28A0092B-C50C-407E-A947-70E740481C1C}">
                           <a14:useLocalDpi xmlns:a14="http://schemas.microsoft.com/office/drawing/2010/main" val="0"/>
@@ -3681,7 +3537,7 @@
                     </pic:cNvPicPr>
                   </pic:nvPicPr>
                   <pic:blipFill>
-                    <a:blip r:embed="rId14">
+                    <a:blip r:embed="rId17">
                       <a:extLst>
                         <a:ext uri="{28A0092B-C50C-407E-A947-70E740481C1C}">
                           <a14:useLocalDpi xmlns:a14="http://schemas.microsoft.com/office/drawing/2010/main" val="0"/>
@@ -3750,7 +3606,7 @@
                     </pic:cNvPicPr>
                   </pic:nvPicPr>
                   <pic:blipFill>
-                    <a:blip r:embed="rId15">
+                    <a:blip r:embed="rId18">
                       <a:extLst>
                         <a:ext uri="{28A0092B-C50C-407E-A947-70E740481C1C}">
                           <a14:useLocalDpi xmlns:a14="http://schemas.microsoft.com/office/drawing/2010/main" val="0"/>
@@ -3920,7 +3776,7 @@
                     </pic:cNvPicPr>
                   </pic:nvPicPr>
                   <pic:blipFill>
-                    <a:blip r:embed="rId16">
+                    <a:blip r:embed="rId19">
                       <a:extLst>
                         <a:ext uri="{28A0092B-C50C-407E-A947-70E740481C1C}">
                           <a14:useLocalDpi xmlns:a14="http://schemas.microsoft.com/office/drawing/2010/main" val="0"/>
@@ -3973,7 +3829,7 @@
     </w:p>
     <w:p>
       <w:pPr>
-        <w:pStyle w:val="Prrafodelista"/>
+        <w:pStyle w:val="ListParagraph"/>
         <w:numPr>
           <w:ilvl w:val="0"/>
           <w:numId w:val="1"/>
@@ -4001,7 +3857,7 @@
     </w:p>
     <w:p>
       <w:pPr>
-        <w:pStyle w:val="Prrafodelista"/>
+        <w:pStyle w:val="ListParagraph"/>
         <w:spacing w:line="276" w:lineRule="auto"/>
         <w:ind w:firstLine="0"/>
         <w:contextualSpacing/>
@@ -4015,7 +3871,7 @@
     </w:p>
     <w:p>
       <w:pPr>
-        <w:pStyle w:val="Prrafodelista"/>
+        <w:pStyle w:val="ListParagraph"/>
         <w:spacing w:line="276" w:lineRule="auto"/>
         <w:ind w:firstLine="0"/>
         <w:contextualSpacing/>
@@ -4029,7 +3885,7 @@
     </w:p>
     <w:p>
       <w:pPr>
-        <w:pStyle w:val="Prrafodelista"/>
+        <w:pStyle w:val="ListParagraph"/>
         <w:spacing w:after="0" w:line="276" w:lineRule="auto"/>
         <w:ind w:left="360" w:firstLine="0"/>
         <w:contextualSpacing/>
@@ -4058,7 +3914,7 @@
     </w:p>
     <w:p>
       <w:pPr>
-        <w:pStyle w:val="Prrafodelista"/>
+        <w:pStyle w:val="ListParagraph"/>
         <w:spacing w:after="0" w:line="276" w:lineRule="auto"/>
         <w:ind w:left="360" w:firstLine="0"/>
         <w:contextualSpacing/>
@@ -4073,7 +3929,7 @@
     </w:p>
     <w:p>
       <w:pPr>
-        <w:pStyle w:val="Prrafodelista"/>
+        <w:pStyle w:val="ListParagraph"/>
         <w:spacing w:after="0" w:line="276" w:lineRule="auto"/>
         <w:ind w:left="360" w:firstLine="0"/>
         <w:contextualSpacing/>
@@ -4161,7 +4017,6 @@
           <w:id w:val="-1048454758"/>
           <w:citation/>
         </w:sdtPr>
-        <w:sdtEndPr/>
         <w:sdtContent>
           <w:r>
             <w:rPr>
@@ -4234,7 +4089,6 @@
           <w:id w:val="245688103"/>
           <w:citation/>
         </w:sdtPr>
-        <w:sdtEndPr/>
         <w:sdtContent>
           <w:r>
             <w:rPr>
@@ -4291,7 +4145,6 @@
           <w:id w:val="1739213034"/>
           <w:citation/>
         </w:sdtPr>
-        <w:sdtEndPr/>
         <w:sdtContent>
           <w:r>
             <w:rPr>
@@ -4348,7 +4201,6 @@
           <w:id w:val="932326710"/>
           <w:citation/>
         </w:sdtPr>
-        <w:sdtEndPr/>
         <w:sdtContent>
           <w:r>
             <w:rPr>
@@ -4632,7 +4484,6 @@
           <w:id w:val="1805958984"/>
           <w:citation/>
         </w:sdtPr>
-        <w:sdtEndPr/>
         <w:sdtContent>
           <w:r>
             <w:rPr>
@@ -4746,7 +4597,6 @@
           <w:id w:val="378675076"/>
           <w:citation/>
         </w:sdtPr>
-        <w:sdtEndPr/>
         <w:sdtContent>
           <w:r>
             <w:rPr>
@@ -4803,7 +4653,6 @@
           <w:id w:val="-2140879381"/>
           <w:citation/>
         </w:sdtPr>
-        <w:sdtEndPr/>
         <w:sdtContent>
           <w:r>
             <w:rPr>
@@ -4861,7 +4710,7 @@
     </w:p>
     <w:p>
       <w:pPr>
-        <w:pStyle w:val="Prrafodelista"/>
+        <w:pStyle w:val="ListParagraph"/>
         <w:spacing w:after="0" w:line="276" w:lineRule="auto"/>
         <w:ind w:left="360" w:firstLine="0"/>
         <w:contextualSpacing/>
@@ -4874,7 +4723,7 @@
     </w:p>
     <w:p>
       <w:pPr>
-        <w:pStyle w:val="Prrafodelista"/>
+        <w:pStyle w:val="ListParagraph"/>
         <w:spacing w:line="276" w:lineRule="auto"/>
         <w:ind w:firstLine="0"/>
         <w:contextualSpacing/>
@@ -4888,7 +4737,7 @@
     </w:p>
     <w:p>
       <w:pPr>
-        <w:pStyle w:val="Prrafodelista"/>
+        <w:pStyle w:val="ListParagraph"/>
         <w:numPr>
           <w:ilvl w:val="0"/>
           <w:numId w:val="1"/>
@@ -4915,7 +4764,7 @@
     </w:p>
     <w:p>
       <w:pPr>
-        <w:pStyle w:val="Prrafodelista"/>
+        <w:pStyle w:val="ListParagraph"/>
         <w:spacing w:line="276" w:lineRule="auto"/>
         <w:ind w:firstLine="0"/>
         <w:contextualSpacing/>
@@ -4952,7 +4801,7 @@
         </w:rPr>
         <w:t xml:space="preserve">Cobacho, J., Fernández, M., &amp; Ballesta, J. (2016). La enseñanza de la Quíimica en Bachillerato: directrices y actuaciones prácticas. Un destello de luz en el camino competencial. Juana-Revista, 6(2). Obtenido de </w:t>
       </w:r>
-      <w:hyperlink r:id="rId17" w:history="1">
+      <w:hyperlink r:id="rId20" w:history="1">
         <w:r>
           <w:rPr>
             <w:rFonts w:eastAsia="Calibri"/>
@@ -5318,7 +5167,7 @@
       </w:pPr>
     </w:p>
     <w:sectPr>
-      <w:headerReference w:type="default" r:id="rId18"/>
+      <w:headerReference w:type="default" r:id="rId21"/>
       <w:pgSz w:w="12240" w:h="15840"/>
       <w:pgMar w:top="1418" w:right="1418" w:bottom="1418" w:left="1418" w:header="709" w:footer="709" w:gutter="0"/>
       <w:pgNumType w:start="1"/>
@@ -5329,7 +5178,7 @@
 </file>
 
 <file path=word/endnotes.xml><?xml version="1.0" encoding="utf-8"?>
-<w:endnotes xmlns:wpc="http://schemas.microsoft.com/office/word/2010/wordprocessingCanvas" xmlns:cx="http://schemas.microsoft.com/office/drawing/2014/chartex" xmlns:cx1="http://schemas.microsoft.com/office/drawing/2015/9/8/chartex" xmlns:cx2="http://schemas.microsoft.com/office/drawing/2015/10/21/chartex" xmlns:cx3="http://schemas.microsoft.com/office/drawing/2016/5/9/chartex" xmlns:cx4="http://schemas.microsoft.com/office/drawing/2016/5/10/chartex" xmlns:cx5="http://schemas.microsoft.com/office/drawing/2016/5/11/chartex" xmlns:cx6="http://schemas.microsoft.com/office/drawing/2016/5/12/chartex" xmlns:cx7="http://schemas.microsoft.com/office/drawing/2016/5/13/chartex" xmlns:cx8="http://schemas.microsoft.com/office/drawing/2016/5/14/chartex" xmlns:mc="http://schemas.openxmlformats.org/markup-compatibility/2006" xmlns:aink="http://schemas.microsoft.com/office/drawing/2016/ink" xmlns:am3d="http://schemas.microsoft.com/office/drawing/2017/model3d" xmlns:o="urn:schemas-microsoft-com:office:office" xmlns:r="http://schemas.openxmlformats.org/officeDocument/2006/relationships" xmlns:m="http://schemas.openxmlformats.org/officeDocument/2006/math" xmlns:v="urn:schemas-microsoft-com:vml" xmlns:wp14="http://schemas.microsoft.com/office/word/2010/wordprocessingDrawing" xmlns:wp="http://schemas.openxmlformats.org/drawingml/2006/wordprocessingDrawing" xmlns:w10="urn:schemas-microsoft-com:office:word" xmlns:w="http://schemas.openxmlformats.org/wordprocessingml/2006/main" xmlns:w14="http://schemas.microsoft.com/office/word/2010/wordml" xmlns:w15="http://schemas.microsoft.com/office/word/2012/wordml" xmlns:w16cex="http://schemas.microsoft.com/office/word/2018/wordml/cex" xmlns:w16cid="http://schemas.microsoft.com/office/word/2016/wordml/cid" xmlns:w16="http://schemas.microsoft.com/office/word/2018/wordml" xmlns:w16sdtdh="http://schemas.microsoft.com/office/word/2020/wordml/sdtdatahash" xmlns:w16se="http://schemas.microsoft.com/office/word/2015/wordml/symex" xmlns:wpg="http://schemas.microsoft.com/office/word/2010/wordprocessingGroup" xmlns:wpi="http://schemas.microsoft.com/office/word/2010/wordprocessingInk" xmlns:wne="http://schemas.microsoft.com/office/word/2006/wordml" xmlns:wps="http://schemas.microsoft.com/office/word/2010/wordprocessingShape" mc:Ignorable="w14 w15 w16se w16cid w16 w16cex w16sdtdh wp14">
+<w:endnotes xmlns:wpc="http://schemas.microsoft.com/office/word/2010/wordprocessingCanvas" xmlns:cx="http://schemas.microsoft.com/office/drawing/2014/chartex" xmlns:cx1="http://schemas.microsoft.com/office/drawing/2015/9/8/chartex" xmlns:cx2="http://schemas.microsoft.com/office/drawing/2015/10/21/chartex" xmlns:cx3="http://schemas.microsoft.com/office/drawing/2016/5/9/chartex" xmlns:cx4="http://schemas.microsoft.com/office/drawing/2016/5/10/chartex" xmlns:cx5="http://schemas.microsoft.com/office/drawing/2016/5/11/chartex" xmlns:cx6="http://schemas.microsoft.com/office/drawing/2016/5/12/chartex" xmlns:cx7="http://schemas.microsoft.com/office/drawing/2016/5/13/chartex" xmlns:cx8="http://schemas.microsoft.com/office/drawing/2016/5/14/chartex" xmlns:mc="http://schemas.openxmlformats.org/markup-compatibility/2006" xmlns:aink="http://schemas.microsoft.com/office/drawing/2016/ink" xmlns:am3d="http://schemas.microsoft.com/office/drawing/2017/model3d" xmlns:o="urn:schemas-microsoft-com:office:office" xmlns:oel="http://schemas.microsoft.com/office/2019/extlst" xmlns:r="http://schemas.openxmlformats.org/officeDocument/2006/relationships" xmlns:m="http://schemas.openxmlformats.org/officeDocument/2006/math" xmlns:v="urn:schemas-microsoft-com:vml" xmlns:wp14="http://schemas.microsoft.com/office/word/2010/wordprocessingDrawing" xmlns:wp="http://schemas.openxmlformats.org/drawingml/2006/wordprocessingDrawing" xmlns:w10="urn:schemas-microsoft-com:office:word" xmlns:w="http://schemas.openxmlformats.org/wordprocessingml/2006/main" xmlns:w14="http://schemas.microsoft.com/office/word/2010/wordml" xmlns:w15="http://schemas.microsoft.com/office/word/2012/wordml" xmlns:w16cex="http://schemas.microsoft.com/office/word/2018/wordml/cex" xmlns:w16cid="http://schemas.microsoft.com/office/word/2016/wordml/cid" xmlns:w16="http://schemas.microsoft.com/office/word/2018/wordml" xmlns:w16du="http://schemas.microsoft.com/office/word/2023/wordml/word16du" xmlns:w16sdtdh="http://schemas.microsoft.com/office/word/2020/wordml/sdtdatahash" xmlns:w16se="http://schemas.microsoft.com/office/word/2015/wordml/symex" xmlns:wpg="http://schemas.microsoft.com/office/word/2010/wordprocessingGroup" xmlns:wpi="http://schemas.microsoft.com/office/word/2010/wordprocessingInk" xmlns:wne="http://schemas.microsoft.com/office/word/2006/wordml" xmlns:wps="http://schemas.microsoft.com/office/word/2010/wordprocessingShape" mc:Ignorable="w14 w15 w16se w16cid w16 w16cex w16sdtdh wp14">
   <w:endnote w:type="separator" w:id="-1">
     <w:p>
       <w:pPr>
@@ -5354,7 +5203,7 @@
 </file>
 
 <file path=word/footnotes.xml><?xml version="1.0" encoding="utf-8"?>
-<w:footnotes xmlns:wpc="http://schemas.microsoft.com/office/word/2010/wordprocessingCanvas" xmlns:cx="http://schemas.microsoft.com/office/drawing/2014/chartex" xmlns:cx1="http://schemas.microsoft.com/office/drawing/2015/9/8/chartex" xmlns:cx2="http://schemas.microsoft.com/office/drawing/2015/10/21/chartex" xmlns:cx3="http://schemas.microsoft.com/office/drawing/2016/5/9/chartex" xmlns:cx4="http://schemas.microsoft.com/office/drawing/2016/5/10/chartex" xmlns:cx5="http://schemas.microsoft.com/office/drawing/2016/5/11/chartex" xmlns:cx6="http://schemas.microsoft.com/office/drawing/2016/5/12/chartex" xmlns:cx7="http://schemas.microsoft.com/office/drawing/2016/5/13/chartex" xmlns:cx8="http://schemas.microsoft.com/office/drawing/2016/5/14/chartex" xmlns:mc="http://schemas.openxmlformats.org/markup-compatibility/2006" xmlns:aink="http://schemas.microsoft.com/office/drawing/2016/ink" xmlns:am3d="http://schemas.microsoft.com/office/drawing/2017/model3d" xmlns:o="urn:schemas-microsoft-com:office:office" xmlns:r="http://schemas.openxmlformats.org/officeDocument/2006/relationships" xmlns:m="http://schemas.openxmlformats.org/officeDocument/2006/math" xmlns:v="urn:schemas-microsoft-com:vml" xmlns:wp14="http://schemas.microsoft.com/office/word/2010/wordprocessingDrawing" xmlns:wp="http://schemas.openxmlformats.org/drawingml/2006/wordprocessingDrawing" xmlns:w10="urn:schemas-microsoft-com:office:word" xmlns:w="http://schemas.openxmlformats.org/wordprocessingml/2006/main" xmlns:w14="http://schemas.microsoft.com/office/word/2010/wordml" xmlns:w15="http://schemas.microsoft.com/office/word/2012/wordml" xmlns:w16cex="http://schemas.microsoft.com/office/word/2018/wordml/cex" xmlns:w16cid="http://schemas.microsoft.com/office/word/2016/wordml/cid" xmlns:w16="http://schemas.microsoft.com/office/word/2018/wordml" xmlns:w16sdtdh="http://schemas.microsoft.com/office/word/2020/wordml/sdtdatahash" xmlns:w16se="http://schemas.microsoft.com/office/word/2015/wordml/symex" xmlns:wpg="http://schemas.microsoft.com/office/word/2010/wordprocessingGroup" xmlns:wpi="http://schemas.microsoft.com/office/word/2010/wordprocessingInk" xmlns:wne="http://schemas.microsoft.com/office/word/2006/wordml" xmlns:wps="http://schemas.microsoft.com/office/word/2010/wordprocessingShape" mc:Ignorable="w14 w15 w16se w16cid w16 w16cex w16sdtdh wp14">
+<w:footnotes xmlns:wpc="http://schemas.microsoft.com/office/word/2010/wordprocessingCanvas" xmlns:cx="http://schemas.microsoft.com/office/drawing/2014/chartex" xmlns:cx1="http://schemas.microsoft.com/office/drawing/2015/9/8/chartex" xmlns:cx2="http://schemas.microsoft.com/office/drawing/2015/10/21/chartex" xmlns:cx3="http://schemas.microsoft.com/office/drawing/2016/5/9/chartex" xmlns:cx4="http://schemas.microsoft.com/office/drawing/2016/5/10/chartex" xmlns:cx5="http://schemas.microsoft.com/office/drawing/2016/5/11/chartex" xmlns:cx6="http://schemas.microsoft.com/office/drawing/2016/5/12/chartex" xmlns:cx7="http://schemas.microsoft.com/office/drawing/2016/5/13/chartex" xmlns:cx8="http://schemas.microsoft.com/office/drawing/2016/5/14/chartex" xmlns:mc="http://schemas.openxmlformats.org/markup-compatibility/2006" xmlns:aink="http://schemas.microsoft.com/office/drawing/2016/ink" xmlns:am3d="http://schemas.microsoft.com/office/drawing/2017/model3d" xmlns:o="urn:schemas-microsoft-com:office:office" xmlns:oel="http://schemas.microsoft.com/office/2019/extlst" xmlns:r="http://schemas.openxmlformats.org/officeDocument/2006/relationships" xmlns:m="http://schemas.openxmlformats.org/officeDocument/2006/math" xmlns:v="urn:schemas-microsoft-com:vml" xmlns:wp14="http://schemas.microsoft.com/office/word/2010/wordprocessingDrawing" xmlns:wp="http://schemas.openxmlformats.org/drawingml/2006/wordprocessingDrawing" xmlns:w10="urn:schemas-microsoft-com:office:word" xmlns:w="http://schemas.openxmlformats.org/wordprocessingml/2006/main" xmlns:w14="http://schemas.microsoft.com/office/word/2010/wordml" xmlns:w15="http://schemas.microsoft.com/office/word/2012/wordml" xmlns:w16cex="http://schemas.microsoft.com/office/word/2018/wordml/cex" xmlns:w16cid="http://schemas.microsoft.com/office/word/2016/wordml/cid" xmlns:w16="http://schemas.microsoft.com/office/word/2018/wordml" xmlns:w16du="http://schemas.microsoft.com/office/word/2023/wordml/word16du" xmlns:w16sdtdh="http://schemas.microsoft.com/office/word/2020/wordml/sdtdatahash" xmlns:w16se="http://schemas.microsoft.com/office/word/2015/wordml/symex" xmlns:wpg="http://schemas.microsoft.com/office/word/2010/wordprocessingGroup" xmlns:wpi="http://schemas.microsoft.com/office/word/2010/wordprocessingInk" xmlns:wne="http://schemas.microsoft.com/office/word/2006/wordml" xmlns:wps="http://schemas.microsoft.com/office/word/2010/wordprocessingShape" mc:Ignorable="w14 w15 w16se w16cid w16 w16cex w16sdtdh wp14">
   <w:footnote w:type="separator" w:id="-1">
     <w:p>
       <w:pPr>
@@ -5402,11 +5251,14 @@
         <w:t xml:space="preserve"> </w:t>
       </w:r>
       <w:r>
-        <w:rPr>
-          <w:sz w:val="20"/>
-          <w:szCs w:val="20"/>
-        </w:rPr>
-        <w:t>Profesión. Nivel de formación. Vinculación e Institución. Ciudad (Departamento), País. Correo electrónico. Un ejemplo de este aspecto sería: Licenciado en Lengua Castellana. Especialista en pedagogía de la Virtualidad. Profesor de la Institución Educativa Dos Quebradas. Medellín (Antioquia), Colombia. Correo electrónico: melissa@gmail.com.</w:t>
+        <w:t>Licenciado en Matemáticas y Física</w:t>
+      </w:r>
+      <w:r>
+        <w:rPr>
+          <w:sz w:val="20"/>
+          <w:szCs w:val="20"/>
+        </w:rPr>
+        <w:t>. Nivel de formación. Vinculación e Institución. Ciudad (Departamento), País. Correo electrónico. Un ejemplo de este aspecto sería: Licenciado en Lengua Castellana. Especialista en pedagogía de la Virtualidad. Profesor de la Institución Educativa Dos Quebradas. Medellín (Antioquia), Colombia. Correo electrónico: melissa@gmail.com.</w:t>
       </w:r>
     </w:p>
   </w:footnote>
@@ -5543,7 +5395,7 @@
 </file>
 
 <file path=word/header1.xml><?xml version="1.0" encoding="utf-8"?>
-<w:hdr xmlns:wpc="http://schemas.microsoft.com/office/word/2010/wordprocessingCanvas" xmlns:cx="http://schemas.microsoft.com/office/drawing/2014/chartex" xmlns:cx1="http://schemas.microsoft.com/office/drawing/2015/9/8/chartex" xmlns:cx2="http://schemas.microsoft.com/office/drawing/2015/10/21/chartex" xmlns:cx3="http://schemas.microsoft.com/office/drawing/2016/5/9/chartex" xmlns:cx4="http://schemas.microsoft.com/office/drawing/2016/5/10/chartex" xmlns:cx5="http://schemas.microsoft.com/office/drawing/2016/5/11/chartex" xmlns:cx6="http://schemas.microsoft.com/office/drawing/2016/5/12/chartex" xmlns:cx7="http://schemas.microsoft.com/office/drawing/2016/5/13/chartex" xmlns:cx8="http://schemas.microsoft.com/office/drawing/2016/5/14/chartex" xmlns:mc="http://schemas.openxmlformats.org/markup-compatibility/2006" xmlns:aink="http://schemas.microsoft.com/office/drawing/2016/ink" xmlns:am3d="http://schemas.microsoft.com/office/drawing/2017/model3d" xmlns:o="urn:schemas-microsoft-com:office:office" xmlns:r="http://schemas.openxmlformats.org/officeDocument/2006/relationships" xmlns:m="http://schemas.openxmlformats.org/officeDocument/2006/math" xmlns:v="urn:schemas-microsoft-com:vml" xmlns:wp14="http://schemas.microsoft.com/office/word/2010/wordprocessingDrawing" xmlns:wp="http://schemas.openxmlformats.org/drawingml/2006/wordprocessingDrawing" xmlns:w10="urn:schemas-microsoft-com:office:word" xmlns:w="http://schemas.openxmlformats.org/wordprocessingml/2006/main" xmlns:w14="http://schemas.microsoft.com/office/word/2010/wordml" xmlns:w15="http://schemas.microsoft.com/office/word/2012/wordml" xmlns:w16cex="http://schemas.microsoft.com/office/word/2018/wordml/cex" xmlns:w16cid="http://schemas.microsoft.com/office/word/2016/wordml/cid" xmlns:w16="http://schemas.microsoft.com/office/word/2018/wordml" xmlns:w16sdtdh="http://schemas.microsoft.com/office/word/2020/wordml/sdtdatahash" xmlns:w16se="http://schemas.microsoft.com/office/word/2015/wordml/symex" xmlns:wpg="http://schemas.microsoft.com/office/word/2010/wordprocessingGroup" xmlns:wpi="http://schemas.microsoft.com/office/word/2010/wordprocessingInk" xmlns:wne="http://schemas.microsoft.com/office/word/2006/wordml" xmlns:wps="http://schemas.microsoft.com/office/word/2010/wordprocessingShape" mc:Ignorable="w14 w15 w16se w16cid w16 w16cex w16sdtdh wp14">
+<w:hdr xmlns:wpc="http://schemas.microsoft.com/office/word/2010/wordprocessingCanvas" xmlns:cx="http://schemas.microsoft.com/office/drawing/2014/chartex" xmlns:cx1="http://schemas.microsoft.com/office/drawing/2015/9/8/chartex" xmlns:cx2="http://schemas.microsoft.com/office/drawing/2015/10/21/chartex" xmlns:cx3="http://schemas.microsoft.com/office/drawing/2016/5/9/chartex" xmlns:cx4="http://schemas.microsoft.com/office/drawing/2016/5/10/chartex" xmlns:cx5="http://schemas.microsoft.com/office/drawing/2016/5/11/chartex" xmlns:cx6="http://schemas.microsoft.com/office/drawing/2016/5/12/chartex" xmlns:cx7="http://schemas.microsoft.com/office/drawing/2016/5/13/chartex" xmlns:cx8="http://schemas.microsoft.com/office/drawing/2016/5/14/chartex" xmlns:mc="http://schemas.openxmlformats.org/markup-compatibility/2006" xmlns:aink="http://schemas.microsoft.com/office/drawing/2016/ink" xmlns:am3d="http://schemas.microsoft.com/office/drawing/2017/model3d" xmlns:o="urn:schemas-microsoft-com:office:office" xmlns:oel="http://schemas.microsoft.com/office/2019/extlst" xmlns:r="http://schemas.openxmlformats.org/officeDocument/2006/relationships" xmlns:m="http://schemas.openxmlformats.org/officeDocument/2006/math" xmlns:v="urn:schemas-microsoft-com:vml" xmlns:wp14="http://schemas.microsoft.com/office/word/2010/wordprocessingDrawing" xmlns:wp="http://schemas.openxmlformats.org/drawingml/2006/wordprocessingDrawing" xmlns:w10="urn:schemas-microsoft-com:office:word" xmlns:w="http://schemas.openxmlformats.org/wordprocessingml/2006/main" xmlns:w14="http://schemas.microsoft.com/office/word/2010/wordml" xmlns:w15="http://schemas.microsoft.com/office/word/2012/wordml" xmlns:w16cex="http://schemas.microsoft.com/office/word/2018/wordml/cex" xmlns:w16cid="http://schemas.microsoft.com/office/word/2016/wordml/cid" xmlns:w16="http://schemas.microsoft.com/office/word/2018/wordml" xmlns:w16du="http://schemas.microsoft.com/office/word/2023/wordml/word16du" xmlns:w16sdtdh="http://schemas.microsoft.com/office/word/2020/wordml/sdtdatahash" xmlns:w16se="http://schemas.microsoft.com/office/word/2015/wordml/symex" xmlns:wpg="http://schemas.microsoft.com/office/word/2010/wordprocessingGroup" xmlns:wpi="http://schemas.microsoft.com/office/word/2010/wordprocessingInk" xmlns:wne="http://schemas.microsoft.com/office/word/2006/wordml" xmlns:wps="http://schemas.microsoft.com/office/word/2010/wordprocessingShape" mc:Ignorable="w14 w15 w16se w16cid w16 w16cex w16sdtdh wp14">
   <w:p>
     <w:pPr>
       <w:rPr>
@@ -5593,8 +5445,97 @@
 </file>
 
 <file path=word/numbering.xml><?xml version="1.0" encoding="utf-8"?>
-<w:numbering xmlns:wpc="http://schemas.microsoft.com/office/word/2010/wordprocessingCanvas" xmlns:cx="http://schemas.microsoft.com/office/drawing/2014/chartex" xmlns:cx1="http://schemas.microsoft.com/office/drawing/2015/9/8/chartex" xmlns:cx2="http://schemas.microsoft.com/office/drawing/2015/10/21/chartex" xmlns:cx3="http://schemas.microsoft.com/office/drawing/2016/5/9/chartex" xmlns:cx4="http://schemas.microsoft.com/office/drawing/2016/5/10/chartex" xmlns:cx5="http://schemas.microsoft.com/office/drawing/2016/5/11/chartex" xmlns:cx6="http://schemas.microsoft.com/office/drawing/2016/5/12/chartex" xmlns:cx7="http://schemas.microsoft.com/office/drawing/2016/5/13/chartex" xmlns:cx8="http://schemas.microsoft.com/office/drawing/2016/5/14/chartex" xmlns:mc="http://schemas.openxmlformats.org/markup-compatibility/2006" xmlns:aink="http://schemas.microsoft.com/office/drawing/2016/ink" xmlns:am3d="http://schemas.microsoft.com/office/drawing/2017/model3d" xmlns:o="urn:schemas-microsoft-com:office:office" xmlns:r="http://schemas.openxmlformats.org/officeDocument/2006/relationships" xmlns:m="http://schemas.openxmlformats.org/officeDocument/2006/math" xmlns:v="urn:schemas-microsoft-com:vml" xmlns:wp14="http://schemas.microsoft.com/office/word/2010/wordprocessingDrawing" xmlns:wp="http://schemas.openxmlformats.org/drawingml/2006/wordprocessingDrawing" xmlns:w10="urn:schemas-microsoft-com:office:word" xmlns:w="http://schemas.openxmlformats.org/wordprocessingml/2006/main" xmlns:w14="http://schemas.microsoft.com/office/word/2010/wordml" xmlns:w15="http://schemas.microsoft.com/office/word/2012/wordml" xmlns:w16cex="http://schemas.microsoft.com/office/word/2018/wordml/cex" xmlns:w16cid="http://schemas.microsoft.com/office/word/2016/wordml/cid" xmlns:w16="http://schemas.microsoft.com/office/word/2018/wordml" xmlns:w16sdtdh="http://schemas.microsoft.com/office/word/2020/wordml/sdtdatahash" xmlns:w16se="http://schemas.microsoft.com/office/word/2015/wordml/symex" xmlns:wpg="http://schemas.microsoft.com/office/word/2010/wordprocessingGroup" xmlns:wpi="http://schemas.microsoft.com/office/word/2010/wordprocessingInk" xmlns:wne="http://schemas.microsoft.com/office/word/2006/wordml" xmlns:wps="http://schemas.microsoft.com/office/word/2010/wordprocessingShape" mc:Ignorable="w14 w15 w16se w16cid w16 w16cex w16sdtdh wp14">
+<w:numbering xmlns:wpc="http://schemas.microsoft.com/office/word/2010/wordprocessingCanvas" xmlns:cx="http://schemas.microsoft.com/office/drawing/2014/chartex" xmlns:cx1="http://schemas.microsoft.com/office/drawing/2015/9/8/chartex" xmlns:cx2="http://schemas.microsoft.com/office/drawing/2015/10/21/chartex" xmlns:cx3="http://schemas.microsoft.com/office/drawing/2016/5/9/chartex" xmlns:cx4="http://schemas.microsoft.com/office/drawing/2016/5/10/chartex" xmlns:cx5="http://schemas.microsoft.com/office/drawing/2016/5/11/chartex" xmlns:cx6="http://schemas.microsoft.com/office/drawing/2016/5/12/chartex" xmlns:cx7="http://schemas.microsoft.com/office/drawing/2016/5/13/chartex" xmlns:cx8="http://schemas.microsoft.com/office/drawing/2016/5/14/chartex" xmlns:mc="http://schemas.openxmlformats.org/markup-compatibility/2006" xmlns:aink="http://schemas.microsoft.com/office/drawing/2016/ink" xmlns:am3d="http://schemas.microsoft.com/office/drawing/2017/model3d" xmlns:o="urn:schemas-microsoft-com:office:office" xmlns:oel="http://schemas.microsoft.com/office/2019/extlst" xmlns:r="http://schemas.openxmlformats.org/officeDocument/2006/relationships" xmlns:m="http://schemas.openxmlformats.org/officeDocument/2006/math" xmlns:v="urn:schemas-microsoft-com:vml" xmlns:wp14="http://schemas.microsoft.com/office/word/2010/wordprocessingDrawing" xmlns:wp="http://schemas.openxmlformats.org/drawingml/2006/wordprocessingDrawing" xmlns:w10="urn:schemas-microsoft-com:office:word" xmlns:w="http://schemas.openxmlformats.org/wordprocessingml/2006/main" xmlns:w14="http://schemas.microsoft.com/office/word/2010/wordml" xmlns:w15="http://schemas.microsoft.com/office/word/2012/wordml" xmlns:w16cex="http://schemas.microsoft.com/office/word/2018/wordml/cex" xmlns:w16cid="http://schemas.microsoft.com/office/word/2016/wordml/cid" xmlns:w16="http://schemas.microsoft.com/office/word/2018/wordml" xmlns:w16du="http://schemas.microsoft.com/office/word/2023/wordml/word16du" xmlns:w16sdtdh="http://schemas.microsoft.com/office/word/2020/wordml/sdtdatahash" xmlns:w16se="http://schemas.microsoft.com/office/word/2015/wordml/symex" xmlns:wpg="http://schemas.microsoft.com/office/word/2010/wordprocessingGroup" xmlns:wpi="http://schemas.microsoft.com/office/word/2010/wordprocessingInk" xmlns:wne="http://schemas.microsoft.com/office/word/2006/wordml" xmlns:wps="http://schemas.microsoft.com/office/word/2010/wordprocessingShape" mc:Ignorable="w14 w15 w16se w16cid w16 w16cex w16sdtdh wp14">
   <w:abstractNum w:abstractNumId="0" w15:restartNumberingAfterBreak="0">
+    <w:nsid w:val="3B5C771B"/>
+    <w:multiLevelType w:val="hybridMultilevel"/>
+    <w:tmpl w:val="3AC89A72"/>
+    <w:lvl w:ilvl="0" w:tplc="0409000F">
+      <w:start w:val="1"/>
+      <w:numFmt w:val="decimal"/>
+      <w:lvlText w:val="%1."/>
+      <w:lvlJc w:val="left"/>
+      <w:pPr>
+        <w:ind w:left="720" w:hanging="360"/>
+      </w:pPr>
+      <w:rPr>
+        <w:rFonts w:hint="default"/>
+      </w:rPr>
+    </w:lvl>
+    <w:lvl w:ilvl="1" w:tplc="04090019" w:tentative="1">
+      <w:start w:val="1"/>
+      <w:numFmt w:val="lowerLetter"/>
+      <w:lvlText w:val="%2."/>
+      <w:lvlJc w:val="left"/>
+      <w:pPr>
+        <w:ind w:left="1440" w:hanging="360"/>
+      </w:pPr>
+    </w:lvl>
+    <w:lvl w:ilvl="2" w:tplc="0409001B" w:tentative="1">
+      <w:start w:val="1"/>
+      <w:numFmt w:val="lowerRoman"/>
+      <w:lvlText w:val="%3."/>
+      <w:lvlJc w:val="right"/>
+      <w:pPr>
+        <w:ind w:left="2160" w:hanging="180"/>
+      </w:pPr>
+    </w:lvl>
+    <w:lvl w:ilvl="3" w:tplc="0409000F" w:tentative="1">
+      <w:start w:val="1"/>
+      <w:numFmt w:val="decimal"/>
+      <w:lvlText w:val="%4."/>
+      <w:lvlJc w:val="left"/>
+      <w:pPr>
+        <w:ind w:left="2880" w:hanging="360"/>
+      </w:pPr>
+    </w:lvl>
+    <w:lvl w:ilvl="4" w:tplc="04090019" w:tentative="1">
+      <w:start w:val="1"/>
+      <w:numFmt w:val="lowerLetter"/>
+      <w:lvlText w:val="%5."/>
+      <w:lvlJc w:val="left"/>
+      <w:pPr>
+        <w:ind w:left="3600" w:hanging="360"/>
+      </w:pPr>
+    </w:lvl>
+    <w:lvl w:ilvl="5" w:tplc="0409001B" w:tentative="1">
+      <w:start w:val="1"/>
+      <w:numFmt w:val="lowerRoman"/>
+      <w:lvlText w:val="%6."/>
+      <w:lvlJc w:val="right"/>
+      <w:pPr>
+        <w:ind w:left="4320" w:hanging="180"/>
+      </w:pPr>
+    </w:lvl>
+    <w:lvl w:ilvl="6" w:tplc="0409000F" w:tentative="1">
+      <w:start w:val="1"/>
+      <w:numFmt w:val="decimal"/>
+      <w:lvlText w:val="%7."/>
+      <w:lvlJc w:val="left"/>
+      <w:pPr>
+        <w:ind w:left="5040" w:hanging="360"/>
+      </w:pPr>
+    </w:lvl>
+    <w:lvl w:ilvl="7" w:tplc="04090019" w:tentative="1">
+      <w:start w:val="1"/>
+      <w:numFmt w:val="lowerLetter"/>
+      <w:lvlText w:val="%8."/>
+      <w:lvlJc w:val="left"/>
+      <w:pPr>
+        <w:ind w:left="5760" w:hanging="360"/>
+      </w:pPr>
+    </w:lvl>
+    <w:lvl w:ilvl="8" w:tplc="0409001B" w:tentative="1">
+      <w:start w:val="1"/>
+      <w:numFmt w:val="lowerRoman"/>
+      <w:lvlText w:val="%9."/>
+      <w:lvlJc w:val="right"/>
+      <w:pPr>
+        <w:ind w:left="6480" w:hanging="180"/>
+      </w:pPr>
+    </w:lvl>
+  </w:abstractNum>
+  <w:abstractNum w:abstractNumId="1" w15:restartNumberingAfterBreak="0">
     <w:nsid w:val="68705367"/>
     <w:multiLevelType w:val="hybridMultilevel"/>
     <w:tmpl w:val="9524EA5C"/>
@@ -5707,7 +5648,7 @@
       </w:rPr>
     </w:lvl>
   </w:abstractNum>
-  <w:abstractNum w:abstractNumId="1" w15:restartNumberingAfterBreak="0">
+  <w:abstractNum w:abstractNumId="2" w15:restartNumberingAfterBreak="0">
     <w:nsid w:val="7DDB0C15"/>
     <w:multiLevelType w:val="hybridMultilevel"/>
     <w:tmpl w:val="41C6D980"/>
@@ -5796,11 +5737,14 @@
       </w:pPr>
     </w:lvl>
   </w:abstractNum>
-  <w:num w:numId="1">
+  <w:num w:numId="1" w16cid:durableId="2029866751">
+    <w:abstractNumId w:val="1"/>
+  </w:num>
+  <w:num w:numId="2" w16cid:durableId="2048866927">
+    <w:abstractNumId w:val="2"/>
+  </w:num>
+  <w:num w:numId="3" w16cid:durableId="1614094885">
     <w:abstractNumId w:val="0"/>
-  </w:num>
-  <w:num w:numId="2">
-    <w:abstractNumId w:val="1"/>
   </w:num>
 </w:numbering>
 </file>
@@ -6207,11 +6151,11 @@
     <w:qFormat/>
     <w:rsid w:val="00FF7197"/>
   </w:style>
-  <w:style w:type="paragraph" w:styleId="Ttulo1">
+  <w:style w:type="paragraph" w:styleId="Heading1">
     <w:name w:val="heading 1"/>
     <w:basedOn w:val="Normal"/>
     <w:next w:val="Normal"/>
-    <w:link w:val="Ttulo1Car"/>
+    <w:link w:val="Heading1Char"/>
     <w:uiPriority w:val="9"/>
     <w:qFormat/>
     <w:rsid w:val="00FF7197"/>
@@ -6229,11 +6173,11 @@
       <w:szCs w:val="28"/>
     </w:rPr>
   </w:style>
-  <w:style w:type="paragraph" w:styleId="Ttulo2">
+  <w:style w:type="paragraph" w:styleId="Heading2">
     <w:name w:val="heading 2"/>
     <w:basedOn w:val="Normal"/>
     <w:next w:val="Normal"/>
-    <w:link w:val="Ttulo2Car"/>
+    <w:link w:val="Heading2Char"/>
     <w:uiPriority w:val="9"/>
     <w:semiHidden/>
     <w:unhideWhenUsed/>
@@ -6254,11 +6198,11 @@
       <w:szCs w:val="26"/>
     </w:rPr>
   </w:style>
-  <w:style w:type="paragraph" w:styleId="Ttulo3">
+  <w:style w:type="paragraph" w:styleId="Heading3">
     <w:name w:val="heading 3"/>
     <w:basedOn w:val="Normal"/>
     <w:next w:val="Normal"/>
-    <w:link w:val="Ttulo3Car"/>
+    <w:link w:val="Heading3Char"/>
     <w:uiPriority w:val="9"/>
     <w:semiHidden/>
     <w:unhideWhenUsed/>
@@ -6277,7 +6221,7 @@
       <w:sz w:val="24"/>
     </w:rPr>
   </w:style>
-  <w:style w:type="paragraph" w:styleId="Ttulo4">
+  <w:style w:type="paragraph" w:styleId="Heading4">
     <w:name w:val="heading 4"/>
     <w:basedOn w:val="Normal"/>
     <w:next w:val="Normal"/>
@@ -6297,7 +6241,7 @@
       <w:szCs w:val="24"/>
     </w:rPr>
   </w:style>
-  <w:style w:type="paragraph" w:styleId="Ttulo5">
+  <w:style w:type="paragraph" w:styleId="Heading5">
     <w:name w:val="heading 5"/>
     <w:basedOn w:val="Normal"/>
     <w:next w:val="Normal"/>
@@ -6315,7 +6259,7 @@
       <w:b/>
     </w:rPr>
   </w:style>
-  <w:style w:type="paragraph" w:styleId="Ttulo6">
+  <w:style w:type="paragraph" w:styleId="Heading6">
     <w:name w:val="heading 6"/>
     <w:basedOn w:val="Normal"/>
     <w:next w:val="Normal"/>
@@ -6335,13 +6279,13 @@
       <w:szCs w:val="20"/>
     </w:rPr>
   </w:style>
-  <w:style w:type="character" w:default="1" w:styleId="Fuentedeprrafopredeter">
+  <w:style w:type="character" w:default="1" w:styleId="DefaultParagraphFont">
     <w:name w:val="Default Paragraph Font"/>
     <w:uiPriority w:val="1"/>
     <w:semiHidden/>
     <w:unhideWhenUsed/>
   </w:style>
-  <w:style w:type="table" w:default="1" w:styleId="Tablanormal">
+  <w:style w:type="table" w:default="1" w:styleId="TableNormal">
     <w:name w:val="Normal Table"/>
     <w:uiPriority w:val="99"/>
     <w:semiHidden/>
@@ -6356,14 +6300,14 @@
       </w:tblCellMar>
     </w:tblPr>
   </w:style>
-  <w:style w:type="numbering" w:default="1" w:styleId="Sinlista">
+  <w:style w:type="numbering" w:default="1" w:styleId="NoList">
     <w:name w:val="No List"/>
     <w:uiPriority w:val="99"/>
     <w:semiHidden/>
     <w:unhideWhenUsed/>
   </w:style>
-  <w:style w:type="table" w:customStyle="1" w:styleId="TableNormal">
-    <w:name w:val="Table Normal"/>
+  <w:style w:type="table" w:customStyle="1" w:styleId="TableNormal1">
+    <w:name w:val="Table Normal1"/>
     <w:tblPr>
       <w:tblCellMar>
         <w:top w:w="0" w:type="dxa"/>
@@ -6373,11 +6317,11 @@
       </w:tblCellMar>
     </w:tblPr>
   </w:style>
-  <w:style w:type="paragraph" w:styleId="Ttulo">
+  <w:style w:type="paragraph" w:styleId="Title">
     <w:name w:val="Title"/>
     <w:basedOn w:val="Normal"/>
     <w:next w:val="Normal"/>
-    <w:link w:val="TtuloCar"/>
+    <w:link w:val="TitleChar"/>
     <w:uiPriority w:val="10"/>
     <w:qFormat/>
     <w:rsid w:val="00C31EC6"/>
@@ -6396,8 +6340,8 @@
       <w:szCs w:val="52"/>
     </w:rPr>
   </w:style>
-  <w:style w:type="table" w:customStyle="1" w:styleId="TableNormal0">
-    <w:name w:val="Table Normal"/>
+  <w:style w:type="table" w:customStyle="1" w:styleId="TableNormal2">
+    <w:name w:val="Table Normal2"/>
     <w:tblPr>
       <w:tblCellMar>
         <w:top w:w="0" w:type="dxa"/>
@@ -6407,9 +6351,9 @@
       </w:tblCellMar>
     </w:tblPr>
   </w:style>
-  <w:style w:type="table" w:styleId="Cuadrculaclara">
+  <w:style w:type="table" w:styleId="LightGrid">
     <w:name w:val="Light Grid"/>
-    <w:basedOn w:val="Tablanormal"/>
+    <w:basedOn w:val="TableNormal"/>
     <w:uiPriority w:val="62"/>
     <w:rsid w:val="00E72712"/>
     <w:pPr>
@@ -6530,10 +6474,10 @@
       </w:tcPr>
     </w:tblStylePr>
   </w:style>
-  <w:style w:type="paragraph" w:styleId="Encabezado">
+  <w:style w:type="paragraph" w:styleId="Header">
     <w:name w:val="header"/>
     <w:basedOn w:val="Normal"/>
-    <w:link w:val="EncabezadoCar"/>
+    <w:link w:val="HeaderChar"/>
     <w:uiPriority w:val="99"/>
     <w:unhideWhenUsed/>
     <w:rsid w:val="00E72712"/>
@@ -6545,17 +6489,17 @@
       <w:spacing w:after="0"/>
     </w:pPr>
   </w:style>
-  <w:style w:type="character" w:customStyle="1" w:styleId="EncabezadoCar">
-    <w:name w:val="Encabezado Car"/>
-    <w:basedOn w:val="Fuentedeprrafopredeter"/>
-    <w:link w:val="Encabezado"/>
+  <w:style w:type="character" w:customStyle="1" w:styleId="HeaderChar">
+    <w:name w:val="Header Char"/>
+    <w:basedOn w:val="DefaultParagraphFont"/>
+    <w:link w:val="Header"/>
     <w:uiPriority w:val="99"/>
     <w:rsid w:val="00E72712"/>
   </w:style>
-  <w:style w:type="paragraph" w:styleId="Piedepgina">
+  <w:style w:type="paragraph" w:styleId="Footer">
     <w:name w:val="footer"/>
     <w:basedOn w:val="Normal"/>
-    <w:link w:val="PiedepginaCar"/>
+    <w:link w:val="FooterChar"/>
     <w:uiPriority w:val="99"/>
     <w:unhideWhenUsed/>
     <w:rsid w:val="00E72712"/>
@@ -6567,17 +6511,17 @@
       <w:spacing w:after="0"/>
     </w:pPr>
   </w:style>
-  <w:style w:type="character" w:customStyle="1" w:styleId="PiedepginaCar">
-    <w:name w:val="Pie de página Car"/>
-    <w:basedOn w:val="Fuentedeprrafopredeter"/>
-    <w:link w:val="Piedepgina"/>
+  <w:style w:type="character" w:customStyle="1" w:styleId="FooterChar">
+    <w:name w:val="Footer Char"/>
+    <w:basedOn w:val="DefaultParagraphFont"/>
+    <w:link w:val="Footer"/>
     <w:uiPriority w:val="99"/>
     <w:rsid w:val="00E72712"/>
   </w:style>
-  <w:style w:type="paragraph" w:styleId="Textodeglobo">
+  <w:style w:type="paragraph" w:styleId="BalloonText">
     <w:name w:val="Balloon Text"/>
     <w:basedOn w:val="Normal"/>
-    <w:link w:val="TextodegloboCar"/>
+    <w:link w:val="BalloonTextChar"/>
     <w:uiPriority w:val="99"/>
     <w:semiHidden/>
     <w:unhideWhenUsed/>
@@ -6591,10 +6535,10 @@
       <w:szCs w:val="16"/>
     </w:rPr>
   </w:style>
-  <w:style w:type="character" w:customStyle="1" w:styleId="TextodegloboCar">
-    <w:name w:val="Texto de globo Car"/>
-    <w:basedOn w:val="Fuentedeprrafopredeter"/>
-    <w:link w:val="Textodeglobo"/>
+  <w:style w:type="character" w:customStyle="1" w:styleId="BalloonTextChar">
+    <w:name w:val="Balloon Text Char"/>
+    <w:basedOn w:val="DefaultParagraphFont"/>
+    <w:link w:val="BalloonText"/>
     <w:uiPriority w:val="99"/>
     <w:semiHidden/>
     <w:rsid w:val="00E72712"/>
@@ -6604,9 +6548,9 @@
       <w:szCs w:val="16"/>
     </w:rPr>
   </w:style>
-  <w:style w:type="table" w:styleId="Tablaconcuadrcula">
+  <w:style w:type="table" w:styleId="TableGrid">
     <w:name w:val="Table Grid"/>
-    <w:basedOn w:val="Tablanormal"/>
+    <w:basedOn w:val="TableNormal"/>
     <w:uiPriority w:val="59"/>
     <w:rsid w:val="00E72712"/>
     <w:pPr>
@@ -6623,10 +6567,10 @@
       </w:tblBorders>
     </w:tblPr>
   </w:style>
-  <w:style w:type="character" w:customStyle="1" w:styleId="Ttulo1Car">
-    <w:name w:val="Título 1 Car"/>
-    <w:basedOn w:val="Fuentedeprrafopredeter"/>
-    <w:link w:val="Ttulo1"/>
+  <w:style w:type="character" w:customStyle="1" w:styleId="Heading1Char">
+    <w:name w:val="Heading 1 Char"/>
+    <w:basedOn w:val="DefaultParagraphFont"/>
+    <w:link w:val="Heading1"/>
     <w:uiPriority w:val="9"/>
     <w:rsid w:val="00FF7197"/>
     <w:rPr>
@@ -6637,10 +6581,10 @@
       <w:szCs w:val="28"/>
     </w:rPr>
   </w:style>
-  <w:style w:type="character" w:customStyle="1" w:styleId="TtuloCar">
-    <w:name w:val="Título Car"/>
-    <w:basedOn w:val="Fuentedeprrafopredeter"/>
-    <w:link w:val="Ttulo"/>
+  <w:style w:type="character" w:customStyle="1" w:styleId="TitleChar">
+    <w:name w:val="Title Char"/>
+    <w:basedOn w:val="DefaultParagraphFont"/>
+    <w:link w:val="Title"/>
     <w:uiPriority w:val="10"/>
     <w:rsid w:val="00C31EC6"/>
     <w:rPr>
@@ -6654,10 +6598,10 @@
       <w:szCs w:val="52"/>
     </w:rPr>
   </w:style>
-  <w:style w:type="character" w:customStyle="1" w:styleId="Ttulo2Car">
-    <w:name w:val="Título 2 Car"/>
-    <w:basedOn w:val="Fuentedeprrafopredeter"/>
-    <w:link w:val="Ttulo2"/>
+  <w:style w:type="character" w:customStyle="1" w:styleId="Heading2Char">
+    <w:name w:val="Heading 2 Char"/>
+    <w:basedOn w:val="DefaultParagraphFont"/>
+    <w:link w:val="Heading2"/>
     <w:uiPriority w:val="9"/>
     <w:rsid w:val="00822350"/>
     <w:rPr>
@@ -6669,7 +6613,7 @@
       <w:szCs w:val="26"/>
     </w:rPr>
   </w:style>
-  <w:style w:type="paragraph" w:styleId="Descripcin">
+  <w:style w:type="paragraph" w:styleId="Caption">
     <w:name w:val="caption"/>
     <w:basedOn w:val="Normal"/>
     <w:next w:val="Normal"/>
@@ -6683,9 +6627,9 @@
       <w:szCs w:val="18"/>
     </w:rPr>
   </w:style>
-  <w:style w:type="character" w:styleId="Hipervnculo">
+  <w:style w:type="character" w:styleId="Hyperlink">
     <w:name w:val="Hyperlink"/>
-    <w:basedOn w:val="Fuentedeprrafopredeter"/>
+    <w:basedOn w:val="DefaultParagraphFont"/>
     <w:uiPriority w:val="99"/>
     <w:unhideWhenUsed/>
     <w:rsid w:val="00AD519E"/>
@@ -6694,11 +6638,11 @@
       <w:u w:val="single"/>
     </w:rPr>
   </w:style>
-  <w:style w:type="paragraph" w:styleId="z-Principiodelformulario">
+  <w:style w:type="paragraph" w:styleId="z-TopofForm">
     <w:name w:val="HTML Top of Form"/>
     <w:basedOn w:val="Normal"/>
     <w:next w:val="Normal"/>
-    <w:link w:val="z-PrincipiodelformularioCar"/>
+    <w:link w:val="z-TopofFormChar"/>
     <w:hidden/>
     <w:uiPriority w:val="99"/>
     <w:semiHidden/>
@@ -6718,10 +6662,10 @@
       <w:szCs w:val="16"/>
     </w:rPr>
   </w:style>
-  <w:style w:type="character" w:customStyle="1" w:styleId="z-PrincipiodelformularioCar">
-    <w:name w:val="z-Principio del formulario Car"/>
-    <w:basedOn w:val="Fuentedeprrafopredeter"/>
-    <w:link w:val="z-Principiodelformulario"/>
+  <w:style w:type="character" w:customStyle="1" w:styleId="z-TopofFormChar">
+    <w:name w:val="z-Top of Form Char"/>
+    <w:basedOn w:val="DefaultParagraphFont"/>
+    <w:link w:val="z-TopofForm"/>
     <w:uiPriority w:val="99"/>
     <w:semiHidden/>
     <w:rsid w:val="005C511A"/>
@@ -6733,11 +6677,11 @@
       <w:lang w:eastAsia="es-CO"/>
     </w:rPr>
   </w:style>
-  <w:style w:type="paragraph" w:styleId="z-Finaldelformulario">
+  <w:style w:type="paragraph" w:styleId="z-BottomofForm">
     <w:name w:val="HTML Bottom of Form"/>
     <w:basedOn w:val="Normal"/>
     <w:next w:val="Normal"/>
-    <w:link w:val="z-FinaldelformularioCar"/>
+    <w:link w:val="z-BottomofFormChar"/>
     <w:hidden/>
     <w:uiPriority w:val="99"/>
     <w:unhideWhenUsed/>
@@ -6756,10 +6700,10 @@
       <w:szCs w:val="16"/>
     </w:rPr>
   </w:style>
-  <w:style w:type="character" w:customStyle="1" w:styleId="z-FinaldelformularioCar">
-    <w:name w:val="z-Final del formulario Car"/>
-    <w:basedOn w:val="Fuentedeprrafopredeter"/>
-    <w:link w:val="z-Finaldelformulario"/>
+  <w:style w:type="character" w:customStyle="1" w:styleId="z-BottomofFormChar">
+    <w:name w:val="z-Bottom of Form Char"/>
+    <w:basedOn w:val="DefaultParagraphFont"/>
+    <w:link w:val="z-BottomofForm"/>
     <w:uiPriority w:val="99"/>
     <w:rsid w:val="005C511A"/>
     <w:rPr>
@@ -6770,10 +6714,10 @@
       <w:lang w:eastAsia="es-CO"/>
     </w:rPr>
   </w:style>
-  <w:style w:type="paragraph" w:styleId="Textonotapie">
+  <w:style w:type="paragraph" w:styleId="FootnoteText">
     <w:name w:val="footnote text"/>
     <w:basedOn w:val="Normal"/>
-    <w:link w:val="TextonotapieCar"/>
+    <w:link w:val="FootnoteTextChar"/>
     <w:uiPriority w:val="99"/>
     <w:semiHidden/>
     <w:unhideWhenUsed/>
@@ -6785,10 +6729,10 @@
       <w:szCs w:val="20"/>
     </w:rPr>
   </w:style>
-  <w:style w:type="character" w:customStyle="1" w:styleId="TextonotapieCar">
-    <w:name w:val="Texto nota pie Car"/>
-    <w:basedOn w:val="Fuentedeprrafopredeter"/>
-    <w:link w:val="Textonotapie"/>
+  <w:style w:type="character" w:customStyle="1" w:styleId="FootnoteTextChar">
+    <w:name w:val="Footnote Text Char"/>
+    <w:basedOn w:val="DefaultParagraphFont"/>
+    <w:link w:val="FootnoteText"/>
     <w:uiPriority w:val="99"/>
     <w:semiHidden/>
     <w:rsid w:val="0049532C"/>
@@ -6797,9 +6741,9 @@
       <w:szCs w:val="20"/>
     </w:rPr>
   </w:style>
-  <w:style w:type="character" w:styleId="Refdenotaalpie">
+  <w:style w:type="character" w:styleId="FootnoteReference">
     <w:name w:val="footnote reference"/>
-    <w:basedOn w:val="Fuentedeprrafopredeter"/>
+    <w:basedOn w:val="DefaultParagraphFont"/>
     <w:uiPriority w:val="99"/>
     <w:semiHidden/>
     <w:unhideWhenUsed/>
@@ -6808,7 +6752,7 @@
       <w:vertAlign w:val="superscript"/>
     </w:rPr>
   </w:style>
-  <w:style w:type="paragraph" w:styleId="Prrafodelista">
+  <w:style w:type="paragraph" w:styleId="ListParagraph">
     <w:name w:val="List Paragraph"/>
     <w:basedOn w:val="Normal"/>
     <w:uiPriority w:val="34"/>
@@ -6818,10 +6762,10 @@
       <w:ind w:left="720"/>
     </w:pPr>
   </w:style>
-  <w:style w:type="character" w:customStyle="1" w:styleId="Ttulo3Car">
-    <w:name w:val="Título 3 Car"/>
-    <w:basedOn w:val="Fuentedeprrafopredeter"/>
-    <w:link w:val="Ttulo3"/>
+  <w:style w:type="character" w:customStyle="1" w:styleId="Heading3Char">
+    <w:name w:val="Heading 3 Char"/>
+    <w:basedOn w:val="DefaultParagraphFont"/>
+    <w:link w:val="Heading3"/>
     <w:uiPriority w:val="9"/>
     <w:rsid w:val="00822350"/>
     <w:rPr>
@@ -6852,7 +6796,7 @@
       <w:lang w:val="en-US"/>
     </w:rPr>
   </w:style>
-  <w:style w:type="paragraph" w:styleId="Listaconvietas">
+  <w:style w:type="paragraph" w:styleId="ListBullet">
     <w:name w:val="List Bullet"/>
     <w:basedOn w:val="Normal"/>
     <w:uiPriority w:val="99"/>
@@ -6875,9 +6819,9 @@
       <w:lang w:val="es-ES_tradnl"/>
     </w:rPr>
   </w:style>
-  <w:style w:type="character" w:styleId="nfasis">
+  <w:style w:type="character" w:styleId="Emphasis">
     <w:name w:val="Emphasis"/>
-    <w:basedOn w:val="Fuentedeprrafopredeter"/>
+    <w:basedOn w:val="DefaultParagraphFont"/>
     <w:uiPriority w:val="99"/>
     <w:qFormat/>
     <w:rsid w:val="005134C1"/>
@@ -6887,7 +6831,7 @@
       <w:w w:val="100"/>
     </w:rPr>
   </w:style>
-  <w:style w:type="paragraph" w:styleId="Subttulo">
+  <w:style w:type="paragraph" w:styleId="Subtitle">
     <w:name w:val="Subtitle"/>
     <w:basedOn w:val="Normal"/>
     <w:next w:val="Normal"/>
@@ -6908,8 +6852,8 @@
   </w:style>
   <w:style w:type="table" w:customStyle="1" w:styleId="Tablaconcuadrcula2">
     <w:name w:val="Tabla con cuadrícula2"/>
-    <w:basedOn w:val="Tablanormal"/>
-    <w:next w:val="Tablaconcuadrcula"/>
+    <w:basedOn w:val="TableNormal"/>
+    <w:next w:val="TableGrid"/>
     <w:uiPriority w:val="39"/>
     <w:rsid w:val="002C5C1A"/>
     <w:pPr>
@@ -6932,6 +6876,18 @@
         <w:insideV w:val="single" w:sz="4" w:space="0" w:color="auto"/>
       </w:tblBorders>
     </w:tblPr>
+  </w:style>
+  <w:style w:type="character" w:styleId="UnresolvedMention">
+    <w:name w:val="Unresolved Mention"/>
+    <w:basedOn w:val="DefaultParagraphFont"/>
+    <w:uiPriority w:val="99"/>
+    <w:semiHidden/>
+    <w:unhideWhenUsed/>
+    <w:rsid w:val="00515E7D"/>
+    <w:rPr>
+      <w:color w:val="605E5C"/>
+      <w:shd w:val="clear" w:color="auto" w:fill="E1DFDD"/>
+    </w:rPr>
   </w:style>
 </w:styles>
 </file>
@@ -7222,12 +7178,6 @@
 </file>
 
 <file path=customXml/item1.xml><?xml version="1.0" encoding="utf-8"?>
-<go:gDocsCustomXmlDataStorage xmlns:go="http://customooxmlschemas.google.com/" xmlns:r="http://schemas.openxmlformats.org/officeDocument/2006/relationships">
-  <go:docsCustomData xmlns:go="http://customooxmlschemas.google.com/" roundtripDataSignature="AMtx7mib8nt7EA+dExJueHhCTFPGUA/Hag==">AMUW2mWAOXihJmCtt40zm1dmAsLApcAUdoJGupPgUPEG2x/8TeAMgsSv/DwxCUamsp5+G5L6zfp7hb/RrPwQhLbsxoAyhb0SeN+zQZ/UUyrSwCCGJuWtoJw=</go:docsCustomData>
-</go:gDocsCustomXmlDataStorage>
-</file>
-
-<file path=customXml/item2.xml><?xml version="1.0" encoding="utf-8"?>
 <b:Sources xmlns:b="http://schemas.openxmlformats.org/officeDocument/2006/bibliography" xmlns="http://schemas.openxmlformats.org/officeDocument/2006/bibliography" SelectedStyle="\APASixthEditionOfficeOnline.xsl" StyleName="APA" Version="6">
   <b:Source>
     <b:Tag>Tra18</b:Tag>
@@ -7368,19 +7318,25 @@
 </b:Sources>
 </file>
 
+<file path=customXml/item2.xml><?xml version="1.0" encoding="utf-8"?>
+<go:gDocsCustomXmlDataStorage xmlns:go="http://customooxmlschemas.google.com/" xmlns:r="http://schemas.openxmlformats.org/officeDocument/2006/relationships">
+  <go:docsCustomData xmlns:go="http://customooxmlschemas.google.com/" roundtripDataSignature="AMtx7mib8nt7EA+dExJueHhCTFPGUA/Hag==">AMUW2mWAOXihJmCtt40zm1dmAsLApcAUdoJGupPgUPEG2x/8TeAMgsSv/DwxCUamsp5+G5L6zfp7hb/RrPwQhLbsxoAyhb0SeN+zQZ/UUyrSwCCGJuWtoJw=</go:docsCustomData>
+</go:gDocsCustomXmlDataStorage>
+</file>
+
 <file path=customXml/itemProps1.xml><?xml version="1.0" encoding="utf-8"?>
+<ds:datastoreItem xmlns:ds="http://schemas.openxmlformats.org/officeDocument/2006/customXml" ds:itemID="{E115BA06-E6A2-4FFF-AED8-F62B995FFC7D}">
+  <ds:schemaRefs>
+    <ds:schemaRef ds:uri="http://schemas.openxmlformats.org/officeDocument/2006/bibliography"/>
+  </ds:schemaRefs>
+</ds:datastoreItem>
+</file>
+
+<file path=customXml/itemProps2.xml><?xml version="1.0" encoding="utf-8"?>
 <ds:datastoreItem xmlns:ds="http://schemas.openxmlformats.org/officeDocument/2006/customXml" ds:itemID="{11111111-1234-1234-1234-123412341234}">
   <ds:schemaRefs>
     <ds:schemaRef ds:uri="http://customooxmlschemas.google.com/"/>
     <ds:schemaRef ds:uri="http://schemas.openxmlformats.org/officeDocument/2006/relationships"/>
   </ds:schemaRefs>
 </ds:datastoreItem>
-</file>
-
-<file path=customXml/itemProps2.xml><?xml version="1.0" encoding="utf-8"?>
-<ds:datastoreItem xmlns:ds="http://schemas.openxmlformats.org/officeDocument/2006/customXml" ds:itemID="{E115BA06-E6A2-4FFF-AED8-F62B995FFC7D}">
-  <ds:schemaRefs>
-    <ds:schemaRef ds:uri="http://schemas.openxmlformats.org/officeDocument/2006/bibliography"/>
-  </ds:schemaRefs>
-</ds:datastoreItem>
 </file>
</xml_diff>